<commit_message>
Added name + matr nr Answered Q11+12, revised Q8+9
</commit_message>
<xml_diff>
--- a/Report.docx
+++ b/Report.docx
@@ -453,7 +453,19 @@
         <w:rPr>
           <w:lang w:val="en-US"/>
         </w:rPr>
-        <w:t xml:space="preserve">The smartwatch uses the Einthoven I lead; one electrode placed on each of the subject’s wrist. This yields less pronounced amplitudes than the </w:t>
+        <w:t xml:space="preserve">The smartwatch uses the Einthoven I lead; one electrode placed on each of the subject’s </w:t>
+      </w:r>
+      <w:r>
+        <w:rPr>
+          <w:lang w:val="en-US"/>
+        </w:rPr>
+        <w:t>wrists</w:t>
+      </w:r>
+      <w:r>
+        <w:rPr>
+          <w:lang w:val="en-US"/>
+        </w:rPr>
+        <w:t xml:space="preserve">. This yields less pronounced amplitudes than the </w:t>
       </w:r>
       <w:r>
         <w:rPr>
@@ -465,6 +477,12 @@
         <w:rPr>
           <w:lang w:val="en-US"/>
         </w:rPr>
+        <w:t xml:space="preserve"> lead</w:t>
+      </w:r>
+      <w:r>
+        <w:rPr>
+          <w:lang w:val="en-US"/>
+        </w:rPr>
         <w:t>. The QRS complex is much flatter, with the Q entirely invisible and the R amplitude significantly reduced. The P- and T-waves are less pronounced and hard to separate from background noise.</w:t>
       </w:r>
       <w:r>
@@ -591,19 +609,7 @@
         <w:rPr>
           <w:lang w:val="en-US"/>
         </w:rPr>
-        <w:t xml:space="preserve">) </w:t>
-      </w:r>
-      <w:r>
-        <w:rPr>
-          <w:lang w:val="en-US"/>
-        </w:rPr>
-        <w:t>of recording</w:t>
-      </w:r>
-      <w:r>
-        <w:rPr>
-          <w:lang w:val="en-US"/>
-        </w:rPr>
-        <w:t xml:space="preserve"> for the PPG value of each entry</w:t>
+        <w:t>) of recording for the PPG value of each entry</w:t>
       </w:r>
     </w:p>
     <w:p>
@@ -635,25 +641,428 @@
         <w:rPr>
           <w:lang w:val="en-US"/>
         </w:rPr>
-        <w:t xml:space="preserve">ADXL Timestamp: </w:t>
-      </w:r>
-      <w:r>
-        <w:rPr>
-          <w:lang w:val="en-US"/>
-        </w:rPr>
-        <w:t xml:space="preserve">Time (in Unix time, down to a thousandth of a second) of recording for the </w:t>
-      </w:r>
-      <w:r>
-        <w:rPr>
-          <w:lang w:val="en-US"/>
-        </w:rPr>
-        <w:t>accelerometer</w:t>
-      </w:r>
-      <w:r>
-        <w:rPr>
-          <w:lang w:val="en-US"/>
-        </w:rPr>
-        <w:t xml:space="preserve"> value</w:t>
+        <w:t>ADXL Timestamp: Time (in Unix time, down to a thousandth of a second) of recording for the accelerometer values of each entry</w:t>
+      </w:r>
+    </w:p>
+    <w:p>
+      <w:pPr>
+        <w:rPr>
+          <w:lang w:val="en-US"/>
+        </w:rPr>
+      </w:pPr>
+      <w:r>
+        <w:rPr>
+          <w:lang w:val="en-US"/>
+        </w:rPr>
+        <w:t xml:space="preserve">X: X-axis (left/right) value of accelerometer  </w:t>
+      </w:r>
+    </w:p>
+    <w:p>
+      <w:pPr>
+        <w:rPr>
+          <w:lang w:val="en-US"/>
+        </w:rPr>
+      </w:pPr>
+      <w:r>
+        <w:rPr>
+          <w:lang w:val="en-US"/>
+        </w:rPr>
+        <w:t>Y: Y-axis (depth/inward) value of accelerometer</w:t>
+      </w:r>
+    </w:p>
+    <w:p>
+      <w:pPr>
+        <w:rPr>
+          <w:lang w:val="en-US"/>
+        </w:rPr>
+      </w:pPr>
+      <w:r>
+        <w:rPr>
+          <w:lang w:val="en-US"/>
+        </w:rPr>
+        <w:t>Z: Z-axis (vertical/gravity) value of accelerometer</w:t>
+      </w:r>
+    </w:p>
+    <w:p>
+      <w:pPr>
+        <w:rPr>
+          <w:lang w:val="en-US"/>
+        </w:rPr>
+      </w:pPr>
+    </w:p>
+    <w:p>
+      <w:pPr>
+        <w:rPr>
+          <w:b/>
+          <w:bCs/>
+          <w:lang w:val="en-US"/>
+        </w:rPr>
+      </w:pPr>
+      <w:r>
+        <w:rPr>
+          <w:b/>
+          <w:bCs/>
+          <w:lang w:val="en-US"/>
+        </w:rPr>
+        <w:t>Q</w:t>
+      </w:r>
+      <w:r>
+        <w:rPr>
+          <w:b/>
+          <w:bCs/>
+          <w:lang w:val="en-US"/>
+        </w:rPr>
+        <w:t>8</w:t>
+      </w:r>
+      <w:r>
+        <w:rPr>
+          <w:b/>
+          <w:bCs/>
+          <w:lang w:val="en-US"/>
+        </w:rPr>
+        <w:tab/>
+      </w:r>
+      <w:r>
+        <w:rPr>
+          <w:b/>
+          <w:bCs/>
+          <w:lang w:val="en-US"/>
+        </w:rPr>
+        <w:t xml:space="preserve">Make 2 plots (one above the other) of the ECG from the </w:t>
+      </w:r>
+      <w:proofErr w:type="spellStart"/>
+      <w:r>
+        <w:rPr>
+          <w:b/>
+          <w:bCs/>
+          <w:lang w:val="en-US"/>
+        </w:rPr>
+        <w:t>Biopac</w:t>
+      </w:r>
+      <w:proofErr w:type="spellEnd"/>
+      <w:r>
+        <w:rPr>
+          <w:b/>
+          <w:bCs/>
+          <w:lang w:val="en-US"/>
+        </w:rPr>
+        <w:t xml:space="preserve"> device and</w:t>
+      </w:r>
+    </w:p>
+    <w:p>
+      <w:pPr>
+        <w:rPr>
+          <w:b/>
+          <w:bCs/>
+          <w:lang w:val="en-US"/>
+        </w:rPr>
+      </w:pPr>
+      <w:r>
+        <w:rPr>
+          <w:b/>
+          <w:bCs/>
+          <w:lang w:val="en-US"/>
+        </w:rPr>
+        <w:t>the smartwatch. What do you notice about the position of the artefact you introduced on both</w:t>
+      </w:r>
+    </w:p>
+    <w:p>
+      <w:pPr>
+        <w:rPr>
+          <w:b/>
+          <w:bCs/>
+          <w:lang w:val="en-US"/>
+        </w:rPr>
+      </w:pPr>
+      <w:r>
+        <w:rPr>
+          <w:b/>
+          <w:bCs/>
+          <w:lang w:val="en-US"/>
+        </w:rPr>
+        <w:t xml:space="preserve">plots? Make 2 plots (one above the other) of the PPG from the </w:t>
+      </w:r>
+      <w:proofErr w:type="spellStart"/>
+      <w:r>
+        <w:rPr>
+          <w:b/>
+          <w:bCs/>
+          <w:lang w:val="en-US"/>
+        </w:rPr>
+        <w:t>Biopac</w:t>
+      </w:r>
+      <w:proofErr w:type="spellEnd"/>
+      <w:r>
+        <w:rPr>
+          <w:b/>
+          <w:bCs/>
+          <w:lang w:val="en-US"/>
+        </w:rPr>
+        <w:t xml:space="preserve"> device and the</w:t>
+      </w:r>
+    </w:p>
+    <w:p>
+      <w:pPr>
+        <w:rPr>
+          <w:b/>
+          <w:bCs/>
+          <w:lang w:val="en-US"/>
+        </w:rPr>
+      </w:pPr>
+      <w:r>
+        <w:rPr>
+          <w:b/>
+          <w:bCs/>
+          <w:lang w:val="en-US"/>
+        </w:rPr>
+        <w:t>smartwatch. What do you notice about the position of the artefact you introduced on both</w:t>
+      </w:r>
+    </w:p>
+    <w:p>
+      <w:pPr>
+        <w:rPr>
+          <w:lang w:val="en-US"/>
+        </w:rPr>
+      </w:pPr>
+      <w:r>
+        <w:rPr>
+          <w:b/>
+          <w:bCs/>
+          <w:lang w:val="en-US"/>
+        </w:rPr>
+        <w:t>plots?</w:t>
+      </w:r>
+    </w:p>
+    <w:p>
+      <w:pPr>
+        <w:rPr>
+          <w:lang w:val="en-US"/>
+        </w:rPr>
+      </w:pPr>
+    </w:p>
+    <w:p>
+      <w:pPr>
+        <w:rPr>
+          <w:lang w:val="en-US"/>
+        </w:rPr>
+      </w:pPr>
+      <w:r>
+        <w:rPr>
+          <w:lang w:val="en-US"/>
+        </w:rPr>
+        <w:t>The arte</w:t>
+      </w:r>
+      <w:r>
+        <w:rPr>
+          <w:lang w:val="en-US"/>
+        </w:rPr>
+        <w:t xml:space="preserve">fact </w:t>
+      </w:r>
+      <w:r>
+        <w:rPr>
+          <w:lang w:val="en-US"/>
+        </w:rPr>
+        <w:t xml:space="preserve">takes </w:t>
+      </w:r>
+      <w:r>
+        <w:rPr>
+          <w:lang w:val="en-US"/>
+        </w:rPr>
+        <w:t xml:space="preserve">a different form. In the </w:t>
+      </w:r>
+      <w:proofErr w:type="spellStart"/>
+      <w:r>
+        <w:rPr>
+          <w:lang w:val="en-US"/>
+        </w:rPr>
+        <w:t>BioPac</w:t>
+      </w:r>
+      <w:proofErr w:type="spellEnd"/>
+      <w:r>
+        <w:rPr>
+          <w:lang w:val="en-US"/>
+        </w:rPr>
+        <w:t xml:space="preserve"> recordings, the artifact is visible as short period of strong positive and negative (in relation to the baseline) amplitudes appearing in rapid succession. In the smartwatch ECG the artifact appears as </w:t>
+      </w:r>
+      <w:r>
+        <w:rPr>
+          <w:lang w:val="en-US"/>
+        </w:rPr>
+        <w:t>two extreme spikes in both directions, followed by a slow return to the baseline. In the smartwatch PPG the artifact appears as a sudden spike in blood pressure. However, after the spike the baseline blood pressure stays on the level of that spike, so it is possible that we failed to introduce a visible artifact entirely, and this is just a natural spike in blood pressure that happened to occur at the same time as our attempt to create noise in the data.</w:t>
+      </w:r>
+      <w:r>
+        <w:rPr>
+          <w:lang w:val="en-US"/>
+        </w:rPr>
+        <w:t xml:space="preserve"> Considering how sudden and extreme the spike is, it is more likely that the smartwatch failed to return to its base value after the disturbance, and that the disturbance changed the results yielded from the further measurements.</w:t>
+      </w:r>
+    </w:p>
+    <w:p>
+      <w:pPr>
+        <w:rPr>
+          <w:lang w:val="en-US"/>
+        </w:rPr>
+      </w:pPr>
+      <w:r>
+        <w:rPr>
+          <w:lang w:val="en-US"/>
+        </w:rPr>
+        <w:t xml:space="preserve">Furthermore, the artifacts appear approximately 1.7 seconds </w:t>
+      </w:r>
+      <w:r>
+        <w:rPr>
+          <w:lang w:val="en-US"/>
+        </w:rPr>
+        <w:t xml:space="preserve">later in the </w:t>
+      </w:r>
+      <w:proofErr w:type="spellStart"/>
+      <w:r>
+        <w:rPr>
+          <w:lang w:val="en-US"/>
+        </w:rPr>
+        <w:t>Biopac</w:t>
+      </w:r>
+      <w:proofErr w:type="spellEnd"/>
+      <w:r>
+        <w:rPr>
+          <w:lang w:val="en-US"/>
+        </w:rPr>
+        <w:t xml:space="preserve"> data compared to the smartwatch’s data in both measurements. The </w:t>
+      </w:r>
+      <w:proofErr w:type="spellStart"/>
+      <w:r>
+        <w:rPr>
+          <w:lang w:val="en-US"/>
+        </w:rPr>
+        <w:t>Biopac</w:t>
+      </w:r>
+      <w:proofErr w:type="spellEnd"/>
+      <w:r>
+        <w:rPr>
+          <w:lang w:val="en-US"/>
+        </w:rPr>
+        <w:t xml:space="preserve"> data appears slightly delayed to the smartwatch’s data.</w:t>
+      </w:r>
+    </w:p>
+    <w:p>
+      <w:pPr>
+        <w:rPr>
+          <w:lang w:val="en-US"/>
+        </w:rPr>
+      </w:pPr>
+    </w:p>
+    <w:p>
+      <w:pPr>
+        <w:rPr>
+          <w:lang w:val="en-US"/>
+        </w:rPr>
+      </w:pPr>
+    </w:p>
+    <w:p>
+      <w:pPr>
+        <w:rPr>
+          <w:b/>
+          <w:bCs/>
+          <w:lang w:val="en-US"/>
+        </w:rPr>
+      </w:pPr>
+      <w:r>
+        <w:rPr>
+          <w:b/>
+          <w:bCs/>
+          <w:lang w:val="en-US"/>
+        </w:rPr>
+        <w:t xml:space="preserve">Q9 </w:t>
+      </w:r>
+      <w:r>
+        <w:rPr>
+          <w:b/>
+          <w:bCs/>
+          <w:lang w:val="en-US"/>
+        </w:rPr>
+        <w:tab/>
+        <w:t>Based on the 2 last questions, propose a way to synchronize the ECG and</w:t>
+      </w:r>
+    </w:p>
+    <w:p>
+      <w:pPr>
+        <w:rPr>
+          <w:b/>
+          <w:bCs/>
+          <w:lang w:val="en-US"/>
+        </w:rPr>
+      </w:pPr>
+      <w:r>
+        <w:rPr>
+          <w:b/>
+          <w:bCs/>
+          <w:lang w:val="en-US"/>
+        </w:rPr>
+        <w:lastRenderedPageBreak/>
+        <w:t xml:space="preserve">PPG from the </w:t>
+      </w:r>
+      <w:proofErr w:type="spellStart"/>
+      <w:r>
+        <w:rPr>
+          <w:b/>
+          <w:bCs/>
+          <w:lang w:val="en-US"/>
+        </w:rPr>
+        <w:t>Biopac</w:t>
+      </w:r>
+      <w:proofErr w:type="spellEnd"/>
+      <w:r>
+        <w:rPr>
+          <w:b/>
+          <w:bCs/>
+          <w:lang w:val="en-US"/>
+        </w:rPr>
+        <w:t xml:space="preserve"> device with those from the smartwatch.</w:t>
+      </w:r>
+    </w:p>
+    <w:p>
+      <w:pPr>
+        <w:rPr>
+          <w:b/>
+          <w:bCs/>
+          <w:lang w:val="en-US"/>
+        </w:rPr>
+      </w:pPr>
+      <w:r>
+        <w:rPr>
+          <w:b/>
+          <w:bCs/>
+          <w:lang w:val="en-US"/>
+        </w:rPr>
+        <w:t>(Maximum one 10 lines paragraph)</w:t>
+      </w:r>
+    </w:p>
+    <w:p>
+      <w:pPr>
+        <w:rPr>
+          <w:b/>
+          <w:bCs/>
+          <w:lang w:val="en-US"/>
+        </w:rPr>
+      </w:pPr>
+    </w:p>
+    <w:p>
+      <w:pPr>
+        <w:rPr>
+          <w:lang w:val="en-US"/>
+        </w:rPr>
+      </w:pPr>
+      <w:r>
+        <w:rPr>
+          <w:lang w:val="en-US"/>
+        </w:rPr>
+        <w:t>Ideally, syncing the artifacts would sync the data. However, s</w:t>
+      </w:r>
+      <w:r>
+        <w:rPr>
+          <w:lang w:val="en-US"/>
+        </w:rPr>
+        <w:t>ince the artefact</w:t>
       </w:r>
       <w:r>
         <w:rPr>
@@ -665,84 +1074,135 @@
         <w:rPr>
           <w:lang w:val="en-US"/>
         </w:rPr>
+        <w:t xml:space="preserve"> w</w:t>
+      </w:r>
+      <w:r>
+        <w:rPr>
+          <w:lang w:val="en-US"/>
+        </w:rPr>
+        <w:t>ere</w:t>
+      </w:r>
+      <w:r>
+        <w:rPr>
+          <w:lang w:val="en-US"/>
+        </w:rPr>
+        <w:t xml:space="preserve"> introduced manually,</w:t>
+      </w:r>
+      <w:r>
+        <w:rPr>
+          <w:lang w:val="en-US"/>
+        </w:rPr>
+        <w:t xml:space="preserve"> the</w:t>
+      </w:r>
+      <w:r>
+        <w:rPr>
+          <w:lang w:val="en-US"/>
+        </w:rPr>
         <w:t xml:space="preserve"> </w:t>
       </w:r>
       <w:r>
         <w:rPr>
           <w:lang w:val="en-US"/>
         </w:rPr>
-        <w:t>of each entry</w:t>
-      </w:r>
-    </w:p>
-    <w:p>
-      <w:pPr>
-        <w:rPr>
-          <w:lang w:val="en-US"/>
-        </w:rPr>
-      </w:pPr>
-      <w:r>
-        <w:rPr>
-          <w:lang w:val="en-US"/>
-        </w:rPr>
-        <w:t xml:space="preserve">X: X-axis (left/right) value of accelerometer  </w:t>
-      </w:r>
-    </w:p>
-    <w:p>
-      <w:pPr>
-        <w:rPr>
-          <w:lang w:val="en-US"/>
-        </w:rPr>
-      </w:pPr>
-      <w:r>
-        <w:rPr>
-          <w:lang w:val="en-US"/>
-        </w:rPr>
-        <w:t>Y: Y-axis (depth/inward) value of accelerometer</w:t>
-      </w:r>
-    </w:p>
-    <w:p>
-      <w:pPr>
-        <w:rPr>
-          <w:lang w:val="en-US"/>
-        </w:rPr>
-      </w:pPr>
-      <w:r>
-        <w:rPr>
-          <w:lang w:val="en-US"/>
-        </w:rPr>
-        <w:t>Z: Z-axis (vertical/gravity) value of accelerometer</w:t>
-      </w:r>
-    </w:p>
-    <w:p>
-      <w:pPr>
-        <w:rPr>
-          <w:lang w:val="en-US"/>
-        </w:rPr>
-      </w:pPr>
-    </w:p>
-    <w:p>
-      <w:pPr>
-        <w:rPr>
-          <w:b/>
-          <w:bCs/>
-          <w:lang w:val="en-US"/>
-        </w:rPr>
-      </w:pPr>
-      <w:r>
-        <w:rPr>
-          <w:b/>
-          <w:bCs/>
-          <w:lang w:val="en-US"/>
-        </w:rPr>
-        <w:t>Q</w:t>
-      </w:r>
-      <w:r>
-        <w:rPr>
-          <w:b/>
-          <w:bCs/>
-          <w:lang w:val="en-US"/>
-        </w:rPr>
-        <w:t>8</w:t>
+        <w:t xml:space="preserve">timing </w:t>
+      </w:r>
+      <w:r>
+        <w:rPr>
+          <w:lang w:val="en-US"/>
+        </w:rPr>
+        <w:t>of</w:t>
+      </w:r>
+      <w:r>
+        <w:rPr>
+          <w:lang w:val="en-US"/>
+        </w:rPr>
+        <w:t xml:space="preserve"> disturbing the sensors</w:t>
+      </w:r>
+      <w:r>
+        <w:rPr>
+          <w:lang w:val="en-US"/>
+        </w:rPr>
+        <w:t xml:space="preserve"> might not have been perfectly in sync</w:t>
+      </w:r>
+      <w:r>
+        <w:rPr>
+          <w:lang w:val="en-US"/>
+        </w:rPr>
+        <w:t xml:space="preserve">. </w:t>
+      </w:r>
+      <w:r>
+        <w:rPr>
+          <w:lang w:val="en-US"/>
+        </w:rPr>
+        <w:t>We suggest using the Unix time data both sensors recorded to align the data, then manually fin</w:t>
+      </w:r>
+      <w:r>
+        <w:rPr>
+          <w:lang w:val="en-US"/>
+        </w:rPr>
+        <w:t>e</w:t>
+      </w:r>
+      <w:r>
+        <w:rPr>
+          <w:lang w:val="en-US"/>
+        </w:rPr>
+        <w:t>tune the alignment using the artifacts and recognizable patterns of the diagram (e.g.</w:t>
+      </w:r>
+      <w:r>
+        <w:rPr>
+          <w:lang w:val="en-US"/>
+        </w:rPr>
+        <w:t xml:space="preserve"> </w:t>
+      </w:r>
+      <w:r>
+        <w:rPr>
+          <w:lang w:val="en-US"/>
+        </w:rPr>
+        <w:t>the R-peaks in the ECG data, and the systole and diastole peaks o</w:t>
+      </w:r>
+      <w:r>
+        <w:rPr>
+          <w:lang w:val="en-US"/>
+        </w:rPr>
+        <w:t>f</w:t>
+      </w:r>
+      <w:r>
+        <w:rPr>
+          <w:lang w:val="en-US"/>
+        </w:rPr>
+        <w:t xml:space="preserve"> the PPG data</w:t>
+      </w:r>
+      <w:r>
+        <w:rPr>
+          <w:lang w:val="en-US"/>
+        </w:rPr>
+        <w:t>).</w:t>
+      </w:r>
+    </w:p>
+    <w:p>
+      <w:pPr>
+        <w:rPr>
+          <w:b/>
+          <w:bCs/>
+          <w:lang w:val="en-US"/>
+        </w:rPr>
+      </w:pPr>
+    </w:p>
+    <w:p>
+      <w:pPr>
+        <w:rPr>
+          <w:b/>
+          <w:bCs/>
+          <w:lang w:val="en-US"/>
+        </w:rPr>
+      </w:pPr>
+      <w:r>
+        <w:rPr>
+          <w:b/>
+          <w:bCs/>
+          <w:lang w:val="en-US"/>
+        </w:rPr>
+        <w:t>Q11</w:t>
       </w:r>
       <w:r>
         <w:rPr>
@@ -758,148 +1218,218 @@
           <w:bCs/>
           <w:lang w:val="en-US"/>
         </w:rPr>
-        <w:t>Make 2 plots (one above the other) of the ECG from the Biopac device and</w:t>
-      </w:r>
-    </w:p>
-    <w:p>
-      <w:pPr>
-        <w:rPr>
-          <w:b/>
-          <w:bCs/>
-          <w:lang w:val="en-US"/>
-        </w:rPr>
-      </w:pPr>
-      <w:r>
-        <w:rPr>
-          <w:b/>
-          <w:bCs/>
-          <w:lang w:val="en-US"/>
-        </w:rPr>
-        <w:t>the smartwatch. What do you notice about the position of the artefact you introduced on both</w:t>
-      </w:r>
-    </w:p>
-    <w:p>
-      <w:pPr>
-        <w:rPr>
-          <w:b/>
-          <w:bCs/>
-          <w:lang w:val="en-US"/>
-        </w:rPr>
-      </w:pPr>
-      <w:r>
-        <w:rPr>
-          <w:b/>
-          <w:bCs/>
-          <w:lang w:val="en-US"/>
-        </w:rPr>
-        <w:t>plots? Make 2 plots (one above the other) of the PPG from the Biopac device and the</w:t>
-      </w:r>
-    </w:p>
-    <w:p>
-      <w:pPr>
-        <w:rPr>
-          <w:b/>
-          <w:bCs/>
-          <w:lang w:val="en-US"/>
-        </w:rPr>
-      </w:pPr>
-      <w:r>
-        <w:rPr>
-          <w:b/>
-          <w:bCs/>
-          <w:lang w:val="en-US"/>
-        </w:rPr>
-        <w:t>smartwatch. What do you notice about the position of the artefact you introduced on both</w:t>
-      </w:r>
-    </w:p>
-    <w:p>
-      <w:pPr>
-        <w:rPr>
-          <w:lang w:val="en-US"/>
-        </w:rPr>
-      </w:pPr>
-      <w:r>
-        <w:rPr>
-          <w:b/>
-          <w:bCs/>
-          <w:lang w:val="en-US"/>
-        </w:rPr>
-        <w:t>plots?</w:t>
-      </w:r>
-    </w:p>
-    <w:p>
-      <w:pPr>
-        <w:rPr>
-          <w:lang w:val="en-US"/>
-        </w:rPr>
-      </w:pPr>
-    </w:p>
-    <w:p>
-      <w:pPr>
-        <w:rPr>
-          <w:lang w:val="en-US"/>
-        </w:rPr>
-      </w:pPr>
-      <w:r>
-        <w:rPr>
-          <w:lang w:val="en-US"/>
-        </w:rPr>
-        <w:t>The arte</w:t>
-      </w:r>
-      <w:r>
-        <w:rPr>
-          <w:lang w:val="en-US"/>
-        </w:rPr>
-        <w:t>fact appears with a slight delay in the recording from the watch compared to the one done with the Biopac device, in both the ECG and PPG data.</w:t>
-      </w:r>
-      <w:r>
-        <w:rPr>
-          <w:lang w:val="en-US"/>
-        </w:rPr>
-        <w:t xml:space="preserve"> </w:t>
-      </w:r>
-    </w:p>
-    <w:p>
-      <w:pPr>
-        <w:rPr>
-          <w:lang w:val="en-US"/>
-        </w:rPr>
-      </w:pPr>
-      <w:r>
-        <w:rPr>
-          <w:lang w:val="en-US"/>
-        </w:rPr>
-        <w:t xml:space="preserve">It also takes a different form. In the BioPac recordings, the artifact is visible as short period of strong positive and negative (in relation to the baseline) amplitudes appearing in rapid succession. In the smartwatch ECG the artifact appears as </w:t>
-      </w:r>
-      <w:r>
-        <w:rPr>
-          <w:lang w:val="en-US"/>
-        </w:rPr>
-        <w:t>two extreme spikes in both directions, followed by a slow return to the baseline. In the smartwatch PPG the artifact appears as a sudden spike in blood pressure. However, after the spike the baseline blood pressure stays on the level of that spike, so it is possible that we failed to introduce a visible artifact entirely, and this is just a natural spike in blood pressure that happened to occur at the same time as our attempt to create noise in the data.</w:t>
-      </w:r>
-    </w:p>
-    <w:p>
-      <w:pPr>
-        <w:rPr>
-          <w:lang w:val="en-US"/>
-        </w:rPr>
-      </w:pPr>
-    </w:p>
-    <w:p>
-      <w:pPr>
-        <w:rPr>
-          <w:b/>
-          <w:bCs/>
-          <w:lang w:val="en-US"/>
-        </w:rPr>
-      </w:pPr>
-      <w:r>
-        <w:rPr>
-          <w:b/>
-          <w:bCs/>
-          <w:lang w:val="en-US"/>
-        </w:rPr>
-        <w:t xml:space="preserve">Q9 </w:t>
+        <w:t>Make 2 plots (one above the other) of the histograms computed from ECG</w:t>
+      </w:r>
+    </w:p>
+    <w:p>
+      <w:pPr>
+        <w:rPr>
+          <w:b/>
+          <w:bCs/>
+          <w:lang w:val="en-US"/>
+        </w:rPr>
+      </w:pPr>
+      <w:r>
+        <w:rPr>
+          <w:b/>
+          <w:bCs/>
+          <w:lang w:val="en-US"/>
+        </w:rPr>
+        <w:t xml:space="preserve">signals recorded with the </w:t>
+      </w:r>
+      <w:proofErr w:type="spellStart"/>
+      <w:r>
+        <w:rPr>
+          <w:b/>
+          <w:bCs/>
+          <w:lang w:val="en-US"/>
+        </w:rPr>
+        <w:t>Biopac</w:t>
+      </w:r>
+      <w:proofErr w:type="spellEnd"/>
+      <w:r>
+        <w:rPr>
+          <w:b/>
+          <w:bCs/>
+          <w:lang w:val="en-US"/>
+        </w:rPr>
+        <w:t xml:space="preserve"> device and the smartwatch. How do you interpret these</w:t>
+      </w:r>
+    </w:p>
+    <w:p>
+      <w:pPr>
+        <w:rPr>
+          <w:b/>
+          <w:bCs/>
+          <w:lang w:val="en-US"/>
+        </w:rPr>
+      </w:pPr>
+      <w:r>
+        <w:rPr>
+          <w:b/>
+          <w:bCs/>
+          <w:lang w:val="en-US"/>
+        </w:rPr>
+        <w:t>histograms?</w:t>
+      </w:r>
+    </w:p>
+    <w:p>
+      <w:pPr>
+        <w:rPr>
+          <w:lang w:val="en-US"/>
+        </w:rPr>
+      </w:pPr>
+    </w:p>
+    <w:p>
+      <w:pPr>
+        <w:rPr>
+          <w:lang w:val="en-US"/>
+        </w:rPr>
+      </w:pPr>
+      <w:r>
+        <w:rPr>
+          <w:lang w:val="en-US"/>
+        </w:rPr>
+        <w:t xml:space="preserve">Apart from the intentionally introduced artifact, the </w:t>
+      </w:r>
+      <w:proofErr w:type="spellStart"/>
+      <w:r>
+        <w:rPr>
+          <w:lang w:val="en-US"/>
+        </w:rPr>
+        <w:t>Biopac</w:t>
+      </w:r>
+      <w:proofErr w:type="spellEnd"/>
+      <w:r>
+        <w:rPr>
+          <w:lang w:val="en-US"/>
+        </w:rPr>
+        <w:t xml:space="preserve"> ECG is fairly regular. There are a few R-peaks with a noticeably higher amplitude than most, and a few segments where the heartrate appears to have slowed down noticeably for 2-3 beats. The histogram appears to be a fairly accurate representation of the subject’s heartbeat, with minimal noise.</w:t>
+      </w:r>
+    </w:p>
+    <w:p>
+      <w:pPr>
+        <w:rPr>
+          <w:lang w:val="en-US"/>
+        </w:rPr>
+      </w:pPr>
+      <w:r>
+        <w:rPr>
+          <w:lang w:val="en-US"/>
+        </w:rPr>
+        <w:t xml:space="preserve">The watch’s histogram by comparison is very noisy. Several extreme amplitudes are noticeable, and after a disturbance that lasted about 15 seconds the baseline has shifted entirely. </w:t>
+      </w:r>
+      <w:r>
+        <w:rPr>
+          <w:lang w:val="en-US"/>
+        </w:rPr>
+        <w:t xml:space="preserve">Furthermore, since the watch is only relying on the Einthoven I lead, even undisturbed segments of the data have reduced information load compared to the data yielded from the </w:t>
+      </w:r>
+      <w:proofErr w:type="spellStart"/>
+      <w:r>
+        <w:rPr>
+          <w:lang w:val="en-US"/>
+        </w:rPr>
+        <w:t>Biopac</w:t>
+      </w:r>
+      <w:proofErr w:type="spellEnd"/>
+      <w:r>
+        <w:rPr>
+          <w:lang w:val="en-US"/>
+        </w:rPr>
+        <w:t xml:space="preserve"> device.</w:t>
+      </w:r>
+    </w:p>
+    <w:p>
+      <w:pPr>
+        <w:rPr>
+          <w:lang w:val="en-US"/>
+        </w:rPr>
+      </w:pPr>
+      <w:r>
+        <w:rPr>
+          <w:lang w:val="en-US"/>
+        </w:rPr>
+        <w:t xml:space="preserve">Interestingly, the points where the subject’s heart rate appears to slow down in the </w:t>
+      </w:r>
+      <w:proofErr w:type="spellStart"/>
+      <w:r>
+        <w:rPr>
+          <w:lang w:val="en-US"/>
+        </w:rPr>
+        <w:t>Biopac</w:t>
+      </w:r>
+      <w:proofErr w:type="spellEnd"/>
+      <w:r>
+        <w:rPr>
+          <w:lang w:val="en-US"/>
+        </w:rPr>
+        <w:t xml:space="preserve"> histogram all but one correlate with disturbances visible in the smartwatch histogram. The most uneven part of the </w:t>
+      </w:r>
+      <w:proofErr w:type="spellStart"/>
+      <w:r>
+        <w:rPr>
+          <w:lang w:val="en-US"/>
+        </w:rPr>
+        <w:t>Biopac</w:t>
+      </w:r>
+      <w:proofErr w:type="spellEnd"/>
+      <w:r>
+        <w:rPr>
+          <w:lang w:val="en-US"/>
+        </w:rPr>
+        <w:t xml:space="preserve"> histogram also appears almost at the same time as the longer disturbance on the smartwatch histogram, which shifted the baseline. </w:t>
+      </w:r>
+    </w:p>
+    <w:p>
+      <w:pPr>
+        <w:rPr>
+          <w:lang w:val="en-US"/>
+        </w:rPr>
+      </w:pPr>
+      <w:r>
+        <w:rPr>
+          <w:lang w:val="en-US"/>
+        </w:rPr>
+        <w:t xml:space="preserve">It is also notable that even when there is visibly more noise in a segment of the </w:t>
+      </w:r>
+      <w:proofErr w:type="spellStart"/>
+      <w:r>
+        <w:rPr>
+          <w:lang w:val="en-US"/>
+        </w:rPr>
+        <w:t>Biopac</w:t>
+      </w:r>
+      <w:proofErr w:type="spellEnd"/>
+      <w:r>
+        <w:rPr>
+          <w:lang w:val="en-US"/>
+        </w:rPr>
+        <w:t xml:space="preserve"> histogram, the QRS complex is still decipherable, as the amplitude of the R peak is always higher than any noise. This is decidedly not the case in the watch’s histogram, where the amplitudes introduced by noise are several times bigger than any measured from a heartbeat. </w:t>
+      </w:r>
+    </w:p>
+    <w:p>
+      <w:pPr>
+        <w:rPr>
+          <w:lang w:val="en-US"/>
+        </w:rPr>
+      </w:pPr>
+    </w:p>
+    <w:p>
+      <w:pPr>
+        <w:rPr>
+          <w:b/>
+          <w:bCs/>
+          <w:lang w:val="en-US"/>
+        </w:rPr>
+      </w:pPr>
+      <w:r>
+        <w:rPr>
+          <w:b/>
+          <w:bCs/>
+          <w:lang w:val="en-US"/>
+        </w:rPr>
+        <w:t>Q12</w:t>
       </w:r>
       <w:r>
         <w:rPr>
@@ -915,54 +1445,228 @@
           <w:bCs/>
           <w:lang w:val="en-US"/>
         </w:rPr>
-        <w:t>Based on the 2 last questions, propose a way to synchronize the ECG and</w:t>
-      </w:r>
-    </w:p>
-    <w:p>
-      <w:pPr>
-        <w:rPr>
-          <w:b/>
-          <w:bCs/>
-          <w:lang w:val="en-US"/>
-        </w:rPr>
-      </w:pPr>
-      <w:r>
-        <w:rPr>
-          <w:b/>
-          <w:bCs/>
-          <w:lang w:val="en-US"/>
-        </w:rPr>
-        <w:t>PPG from the Biopac device with those from the smartwatch.</w:t>
-      </w:r>
-    </w:p>
-    <w:p>
-      <w:pPr>
-        <w:rPr>
-          <w:b/>
-          <w:bCs/>
-          <w:lang w:val="en-US"/>
-        </w:rPr>
-      </w:pPr>
-      <w:r>
-        <w:rPr>
-          <w:b/>
-          <w:bCs/>
-          <w:lang w:val="en-US"/>
-        </w:rPr>
-        <w:t>(Maximum one 10 lines paragraph)</w:t>
-      </w:r>
-    </w:p>
-    <w:p>
-      <w:pPr>
-        <w:rPr>
-          <w:b/>
-          <w:bCs/>
-          <w:lang w:val="en-US"/>
-        </w:rPr>
-      </w:pPr>
-    </w:p>
-    <w:p>
-      <w:pPr>
+        <w:t>Make 2 plots (one above the other) of the histograms computed from PPG</w:t>
+      </w:r>
+    </w:p>
+    <w:p>
+      <w:pPr>
+        <w:rPr>
+          <w:b/>
+          <w:bCs/>
+          <w:lang w:val="en-US"/>
+        </w:rPr>
+      </w:pPr>
+      <w:r>
+        <w:rPr>
+          <w:b/>
+          <w:bCs/>
+          <w:lang w:val="en-US"/>
+        </w:rPr>
+        <w:t xml:space="preserve">signals recorded with the </w:t>
+      </w:r>
+      <w:proofErr w:type="spellStart"/>
+      <w:r>
+        <w:rPr>
+          <w:b/>
+          <w:bCs/>
+          <w:lang w:val="en-US"/>
+        </w:rPr>
+        <w:t>Biopac</w:t>
+      </w:r>
+      <w:proofErr w:type="spellEnd"/>
+      <w:r>
+        <w:rPr>
+          <w:b/>
+          <w:bCs/>
+          <w:lang w:val="en-US"/>
+        </w:rPr>
+        <w:t xml:space="preserve"> device and the smartwatch. How do you interpret these</w:t>
+      </w:r>
+    </w:p>
+    <w:p>
+      <w:pPr>
+        <w:rPr>
+          <w:b/>
+          <w:bCs/>
+          <w:lang w:val="en-US"/>
+        </w:rPr>
+      </w:pPr>
+      <w:r>
+        <w:rPr>
+          <w:b/>
+          <w:bCs/>
+          <w:lang w:val="en-US"/>
+        </w:rPr>
+        <w:t>histograms</w:t>
+      </w:r>
+      <w:r>
+        <w:rPr>
+          <w:b/>
+          <w:bCs/>
+          <w:lang w:val="en-US"/>
+        </w:rPr>
+        <w:t>?</w:t>
+      </w:r>
+    </w:p>
+    <w:p>
+      <w:pPr>
+        <w:rPr>
+          <w:lang w:val="en-US"/>
+        </w:rPr>
+      </w:pPr>
+    </w:p>
+    <w:p>
+      <w:pPr>
+        <w:rPr>
+          <w:lang w:val="en-US"/>
+        </w:rPr>
+      </w:pPr>
+      <w:r>
+        <w:rPr>
+          <w:lang w:val="en-US"/>
+        </w:rPr>
+        <w:t xml:space="preserve">There seems to be very little overlap between the measurements made by both devices. While the </w:t>
+      </w:r>
+      <w:proofErr w:type="spellStart"/>
+      <w:r>
+        <w:rPr>
+          <w:lang w:val="en-US"/>
+        </w:rPr>
+        <w:t>Biopac</w:t>
+      </w:r>
+      <w:proofErr w:type="spellEnd"/>
+      <w:r>
+        <w:rPr>
+          <w:lang w:val="en-US"/>
+        </w:rPr>
+        <w:t xml:space="preserve"> PPG appears reasonably accurate to a possible ground truth, the smartwatch’s data is barely usable. The data is much more noisy</w:t>
+      </w:r>
+      <w:r>
+        <w:rPr>
+          <w:lang w:val="en-US"/>
+        </w:rPr>
+        <w:t xml:space="preserve">, and most changes in average blood pressure visible in the </w:t>
+      </w:r>
+      <w:proofErr w:type="spellStart"/>
+      <w:r>
+        <w:rPr>
+          <w:lang w:val="en-US"/>
+        </w:rPr>
+        <w:t>Biopac</w:t>
+      </w:r>
+      <w:proofErr w:type="spellEnd"/>
+      <w:r>
+        <w:rPr>
+          <w:lang w:val="en-US"/>
+        </w:rPr>
+        <w:t xml:space="preserve"> histogram are barely or not at all represented in the smartwatch’s data. There is also an extreme sudden drop near the end of the smartwatch’s histogram, where the measured value collapses by approximately a third </w:t>
+      </w:r>
+      <w:r>
+        <w:rPr>
+          <w:lang w:val="en-US"/>
+        </w:rPr>
+        <w:t xml:space="preserve">of its value </w:t>
+      </w:r>
+      <w:r>
+        <w:rPr>
+          <w:lang w:val="en-US"/>
+        </w:rPr>
+        <w:t xml:space="preserve">within one cycle. After that drop the watch appears to measure normally again, but with a much lower baseline, </w:t>
+      </w:r>
+      <w:r>
+        <w:rPr>
+          <w:lang w:val="en-US"/>
+        </w:rPr>
+        <w:t>which</w:t>
+      </w:r>
+      <w:r>
+        <w:rPr>
+          <w:lang w:val="en-US"/>
+        </w:rPr>
+        <w:t xml:space="preserve"> raises doubt regarding the validity of that baseline at any point during the measurement. Especially since a disturbance followed by a significantly changed baseline appears at least three times during the measurement period, and those changed baseline</w:t>
+      </w:r>
+      <w:r>
+        <w:rPr>
+          <w:lang w:val="en-US"/>
+        </w:rPr>
+        <w:t>s</w:t>
+      </w:r>
+      <w:r>
+        <w:rPr>
+          <w:lang w:val="en-US"/>
+        </w:rPr>
+        <w:t xml:space="preserve"> do not correlate with changes in average blood pressure observed by </w:t>
+      </w:r>
+      <w:proofErr w:type="spellStart"/>
+      <w:r>
+        <w:rPr>
+          <w:lang w:val="en-US"/>
+        </w:rPr>
+        <w:t>Biopac</w:t>
+      </w:r>
+      <w:proofErr w:type="spellEnd"/>
+      <w:r>
+        <w:rPr>
+          <w:lang w:val="en-US"/>
+        </w:rPr>
+        <w:t xml:space="preserve">. In fact, at the time the </w:t>
+      </w:r>
+      <w:r>
+        <w:rPr>
+          <w:lang w:val="en-US"/>
+        </w:rPr>
+        <w:t xml:space="preserve">aforementioned </w:t>
+      </w:r>
+      <w:r>
+        <w:rPr>
+          <w:lang w:val="en-US"/>
+        </w:rPr>
+        <w:t xml:space="preserve">sudden drop appeared in the smartwatch’ data, the </w:t>
+      </w:r>
+      <w:proofErr w:type="spellStart"/>
+      <w:r>
+        <w:rPr>
+          <w:lang w:val="en-US"/>
+        </w:rPr>
+        <w:t>Biopac</w:t>
+      </w:r>
+      <w:proofErr w:type="spellEnd"/>
+      <w:r>
+        <w:rPr>
+          <w:lang w:val="en-US"/>
+        </w:rPr>
+        <w:t xml:space="preserve"> device measured an increase in blood pressure. </w:t>
+      </w:r>
+    </w:p>
+    <w:p>
+      <w:pPr>
+        <w:rPr>
+          <w:lang w:val="en-US"/>
+        </w:rPr>
+      </w:pPr>
+      <w:r>
+        <w:rPr>
+          <w:lang w:val="en-US"/>
+        </w:rPr>
+        <w:t xml:space="preserve">Much more so than the watch’s ECG data, which was </w:t>
+      </w:r>
+      <w:r>
+        <w:rPr>
+          <w:lang w:val="en-US"/>
+        </w:rPr>
+        <w:t>noisy and derived from a less-than-ideal lead, the watch’s PPG data appears very unreliable.</w:t>
+      </w:r>
+    </w:p>
+    <w:p>
+      <w:pPr>
+        <w:rPr>
+          <w:lang w:val="en-US"/>
+        </w:rPr>
+      </w:pPr>
+    </w:p>
+    <w:p>
+      <w:pPr>
+        <w:pStyle w:val="Heading1"/>
         <w:rPr>
           <w:lang w:val="en-US"/>
         </w:rPr>
@@ -972,231 +1676,6 @@
           <w:lang w:val="en-US"/>
         </w:rPr>
         <w:lastRenderedPageBreak/>
-        <w:t>Ideally, syncing the artifacts would sync the data. However, s</w:t>
-      </w:r>
-      <w:r>
-        <w:rPr>
-          <w:lang w:val="en-US"/>
-        </w:rPr>
-        <w:t xml:space="preserve">ince the artefact was introduced manually, </w:t>
-      </w:r>
-      <w:r>
-        <w:rPr>
-          <w:lang w:val="en-US"/>
-        </w:rPr>
-        <w:t xml:space="preserve">the delay we observed could be a result of uneven timing in disturbing the sensors. We suggest </w:t>
-      </w:r>
-      <w:r>
-        <w:rPr>
-          <w:lang w:val="en-US"/>
-        </w:rPr>
-        <w:t>aligning the R-peaks in the ECG data, and the systole and diastole peaks or the PPG data.</w:t>
-      </w:r>
-    </w:p>
-    <w:p>
-      <w:pPr>
-        <w:rPr>
-          <w:b/>
-          <w:bCs/>
-          <w:lang w:val="en-US"/>
-        </w:rPr>
-      </w:pPr>
-    </w:p>
-    <w:p>
-      <w:pPr>
-        <w:rPr>
-          <w:b/>
-          <w:bCs/>
-          <w:lang w:val="en-US"/>
-        </w:rPr>
-      </w:pPr>
-      <w:r>
-        <w:rPr>
-          <w:b/>
-          <w:bCs/>
-          <w:lang w:val="en-US"/>
-        </w:rPr>
-        <w:t>Q11</w:t>
-      </w:r>
-      <w:r>
-        <w:rPr>
-          <w:b/>
-          <w:bCs/>
-          <w:lang w:val="en-US"/>
-        </w:rPr>
-        <w:tab/>
-      </w:r>
-      <w:r>
-        <w:rPr>
-          <w:b/>
-          <w:bCs/>
-          <w:lang w:val="en-US"/>
-        </w:rPr>
-        <w:t>Make 2 plots (one above the other) of the histograms computed from ECG</w:t>
-      </w:r>
-    </w:p>
-    <w:p>
-      <w:pPr>
-        <w:rPr>
-          <w:b/>
-          <w:bCs/>
-          <w:lang w:val="en-US"/>
-        </w:rPr>
-      </w:pPr>
-      <w:r>
-        <w:rPr>
-          <w:b/>
-          <w:bCs/>
-          <w:lang w:val="en-US"/>
-        </w:rPr>
-        <w:t>signals recorded with the Biopac device and the smartwatch. How do you interpret these</w:t>
-      </w:r>
-    </w:p>
-    <w:p>
-      <w:pPr>
-        <w:rPr>
-          <w:b/>
-          <w:bCs/>
-          <w:lang w:val="en-US"/>
-        </w:rPr>
-      </w:pPr>
-      <w:r>
-        <w:rPr>
-          <w:b/>
-          <w:bCs/>
-          <w:lang w:val="en-US"/>
-        </w:rPr>
-        <w:t>histograms?</w:t>
-      </w:r>
-    </w:p>
-    <w:p>
-      <w:pPr>
-        <w:rPr>
-          <w:lang w:val="en-US"/>
-        </w:rPr>
-      </w:pPr>
-    </w:p>
-    <w:p>
-      <w:pPr>
-        <w:rPr>
-          <w:lang w:val="en-US"/>
-        </w:rPr>
-      </w:pPr>
-    </w:p>
-    <w:p>
-      <w:pPr>
-        <w:rPr>
-          <w:lang w:val="en-US"/>
-        </w:rPr>
-      </w:pPr>
-    </w:p>
-    <w:p>
-      <w:pPr>
-        <w:rPr>
-          <w:b/>
-          <w:bCs/>
-          <w:lang w:val="en-US"/>
-        </w:rPr>
-      </w:pPr>
-      <w:r>
-        <w:rPr>
-          <w:b/>
-          <w:bCs/>
-          <w:lang w:val="en-US"/>
-        </w:rPr>
-        <w:t>Q12</w:t>
-      </w:r>
-      <w:r>
-        <w:rPr>
-          <w:b/>
-          <w:bCs/>
-          <w:lang w:val="en-US"/>
-        </w:rPr>
-        <w:tab/>
-      </w:r>
-      <w:r>
-        <w:rPr>
-          <w:b/>
-          <w:bCs/>
-          <w:lang w:val="en-US"/>
-        </w:rPr>
-        <w:t>Make 2 plots (one above the other) of the histograms computed from PPG</w:t>
-      </w:r>
-    </w:p>
-    <w:p>
-      <w:pPr>
-        <w:rPr>
-          <w:b/>
-          <w:bCs/>
-          <w:lang w:val="en-US"/>
-        </w:rPr>
-      </w:pPr>
-      <w:r>
-        <w:rPr>
-          <w:b/>
-          <w:bCs/>
-          <w:lang w:val="en-US"/>
-        </w:rPr>
-        <w:t>signals recorded with the Biopac device and the smartwatch. How do you interpret these</w:t>
-      </w:r>
-    </w:p>
-    <w:p>
-      <w:pPr>
-        <w:rPr>
-          <w:b/>
-          <w:bCs/>
-          <w:lang w:val="en-US"/>
-        </w:rPr>
-      </w:pPr>
-      <w:r>
-        <w:rPr>
-          <w:b/>
-          <w:bCs/>
-          <w:lang w:val="en-US"/>
-        </w:rPr>
-        <w:t>histograms</w:t>
-      </w:r>
-      <w:r>
-        <w:rPr>
-          <w:b/>
-          <w:bCs/>
-          <w:lang w:val="en-US"/>
-        </w:rPr>
-        <w:t>?</w:t>
-      </w:r>
-    </w:p>
-    <w:p>
-      <w:pPr>
-        <w:rPr>
-          <w:lang w:val="en-US"/>
-        </w:rPr>
-      </w:pPr>
-    </w:p>
-    <w:p>
-      <w:pPr>
-        <w:rPr>
-          <w:lang w:val="en-US"/>
-        </w:rPr>
-      </w:pPr>
-    </w:p>
-    <w:p>
-      <w:pPr>
-        <w:rPr>
-          <w:lang w:val="en-US"/>
-        </w:rPr>
-      </w:pPr>
-    </w:p>
-    <w:p>
-      <w:pPr>
-        <w:pStyle w:val="Heading1"/>
-        <w:rPr>
-          <w:lang w:val="en-US"/>
-        </w:rPr>
-      </w:pPr>
-      <w:r>
-        <w:rPr>
-          <w:lang w:val="en-US"/>
-        </w:rPr>
         <w:t>Literature</w:t>
       </w:r>
     </w:p>
@@ -3083,6 +3562,7 @@
   <w:style w:type="character" w:default="1" w:styleId="DefaultParagraphFont">
     <w:name w:val="Default Paragraph Font"/>
     <w:uiPriority w:val="1"/>
+    <w:semiHidden/>
     <w:unhideWhenUsed/>
   </w:style>
   <w:style w:type="table" w:default="1" w:styleId="TableNormal">
@@ -4033,8 +4513,10 @@
     <w:rsid w:val="000A2E78"/>
     <w:rsid w:val="000C62A0"/>
     <w:rsid w:val="00390A6A"/>
+    <w:rsid w:val="0045224A"/>
     <w:rsid w:val="00532719"/>
     <w:rsid w:val="006A7CFE"/>
+    <w:rsid w:val="006E13AA"/>
     <w:rsid w:val="0075406D"/>
     <w:rsid w:val="00A36F1E"/>
     <w:rsid w:val="00A467CE"/>
@@ -4506,13 +4988,6 @@
     <w:name w:val="A1A637363751459DA36C46A640473D6B"/>
     <w:rsid w:val="000A2E78"/>
   </w:style>
-  <w:style w:type="paragraph" w:customStyle="1" w:styleId="ADC8B0D6F04A4FB0907394AD3AC7F6C8">
-    <w:name w:val="ADC8B0D6F04A4FB0907394AD3AC7F6C8"/>
-    <w:rsid w:val="000C62A0"/>
-    <w:rPr>
-      <w:lang w:val="en-DE" w:eastAsia="en-DE"/>
-    </w:rPr>
-  </w:style>
 </w:styles>
 </file>
 

</xml_diff>

<commit_message>
Added written answer to Q6
</commit_message>
<xml_diff>
--- a/Report.docx
+++ b/Report.docx
@@ -704,6 +704,98 @@
           <w:bCs/>
           <w:lang w:val="en-US"/>
         </w:rPr>
+        <w:t>Q6</w:t>
+      </w:r>
+      <w:r>
+        <w:rPr>
+          <w:b/>
+          <w:bCs/>
+          <w:lang w:val="en-US"/>
+        </w:rPr>
+        <w:tab/>
+      </w:r>
+      <w:r>
+        <w:rPr>
+          <w:b/>
+          <w:bCs/>
+          <w:lang w:val="en-US"/>
+        </w:rPr>
+        <w:t>Design and implement a protocol to recover the name of the axes of the</w:t>
+      </w:r>
+    </w:p>
+    <w:p>
+      <w:pPr>
+        <w:rPr>
+          <w:b/>
+          <w:bCs/>
+          <w:lang w:val="en-US"/>
+        </w:rPr>
+      </w:pPr>
+      <w:r>
+        <w:rPr>
+          <w:b/>
+          <w:bCs/>
+          <w:lang w:val="en-US"/>
+        </w:rPr>
+        <w:t>accelerometer from the smartwatch.</w:t>
+      </w:r>
+    </w:p>
+    <w:p>
+      <w:pPr>
+        <w:rPr>
+          <w:b/>
+          <w:bCs/>
+          <w:lang w:val="en-US"/>
+        </w:rPr>
+      </w:pPr>
+    </w:p>
+    <w:p>
+      <w:pPr>
+        <w:rPr>
+          <w:lang w:val="en-US"/>
+        </w:rPr>
+      </w:pPr>
+      <w:r>
+        <w:rPr>
+          <w:lang w:val="en-US"/>
+        </w:rPr>
+        <w:t>At the beginning of the recording, one should move the smartwatch first back and forth, then left to right clearly and ideally repeatedly to signal which axis (X or Y), corresponds to which direction. The Z-axis is influenced by the earth’s gravity, so no upwards and downwards movement is required.</w:t>
+      </w:r>
+    </w:p>
+    <w:p>
+      <w:pPr>
+        <w:rPr>
+          <w:lang w:val="en-US"/>
+        </w:rPr>
+      </w:pPr>
+      <w:r>
+        <w:rPr>
+          <w:lang w:val="en-US"/>
+        </w:rPr>
+        <w:t xml:space="preserve">Since we did not introduce such movements during the data collection, we have to do our best to guess from the data we have gathered. </w:t>
+      </w:r>
+    </w:p>
+    <w:p>
+      <w:pPr>
+        <w:rPr>
+          <w:lang w:val="en-US"/>
+        </w:rPr>
+      </w:pPr>
+    </w:p>
+    <w:p>
+      <w:pPr>
+        <w:rPr>
+          <w:b/>
+          <w:bCs/>
+          <w:lang w:val="en-US"/>
+        </w:rPr>
+      </w:pPr>
+      <w:r>
+        <w:rPr>
+          <w:b/>
+          <w:bCs/>
+          <w:lang w:val="en-US"/>
+        </w:rPr>
         <w:t>Q</w:t>
       </w:r>
       <w:r>
@@ -894,7 +986,14 @@
         <w:rPr>
           <w:lang w:val="en-US"/>
         </w:rPr>
-        <w:t xml:space="preserve"> Considering how sudden and extreme the spike is, it is more likely that the smartwatch failed to return to its base value after the disturbance, and that the disturbance changed the results yielded from the further measurements.</w:t>
+        <w:t xml:space="preserve"> Considering how </w:t>
+      </w:r>
+      <w:r>
+        <w:rPr>
+          <w:lang w:val="en-US"/>
+        </w:rPr>
+        <w:lastRenderedPageBreak/>
+        <w:t>sudden and extreme the spike is, it is more likely that the smartwatch failed to return to its base value after the disturbance, and that the disturbance changed the results yielded from the further measurements.</w:t>
       </w:r>
     </w:p>
     <w:p>
@@ -998,14 +1097,614 @@
           <w:bCs/>
           <w:lang w:val="en-US"/>
         </w:rPr>
+        <w:t xml:space="preserve">PPG from the </w:t>
+      </w:r>
+      <w:proofErr w:type="spellStart"/>
+      <w:r>
+        <w:rPr>
+          <w:b/>
+          <w:bCs/>
+          <w:lang w:val="en-US"/>
+        </w:rPr>
+        <w:t>Biopac</w:t>
+      </w:r>
+      <w:proofErr w:type="spellEnd"/>
+      <w:r>
+        <w:rPr>
+          <w:b/>
+          <w:bCs/>
+          <w:lang w:val="en-US"/>
+        </w:rPr>
+        <w:t xml:space="preserve"> device with those from the smartwatch.</w:t>
+      </w:r>
+    </w:p>
+    <w:p>
+      <w:pPr>
+        <w:rPr>
+          <w:b/>
+          <w:bCs/>
+          <w:lang w:val="en-US"/>
+        </w:rPr>
+      </w:pPr>
+      <w:r>
+        <w:rPr>
+          <w:b/>
+          <w:bCs/>
+          <w:lang w:val="en-US"/>
+        </w:rPr>
+        <w:t>(Maximum one 10 lines paragraph)</w:t>
+      </w:r>
+    </w:p>
+    <w:p>
+      <w:pPr>
+        <w:rPr>
+          <w:b/>
+          <w:bCs/>
+          <w:lang w:val="en-US"/>
+        </w:rPr>
+      </w:pPr>
+    </w:p>
+    <w:p>
+      <w:pPr>
+        <w:rPr>
+          <w:lang w:val="en-US"/>
+        </w:rPr>
+      </w:pPr>
+      <w:r>
+        <w:rPr>
+          <w:lang w:val="en-US"/>
+        </w:rPr>
+        <w:t>Ideally, syncing the artifacts would sync the data. However, s</w:t>
+      </w:r>
+      <w:r>
+        <w:rPr>
+          <w:lang w:val="en-US"/>
+        </w:rPr>
+        <w:t>ince the artefact</w:t>
+      </w:r>
+      <w:r>
+        <w:rPr>
+          <w:lang w:val="en-US"/>
+        </w:rPr>
+        <w:t>s</w:t>
+      </w:r>
+      <w:r>
+        <w:rPr>
+          <w:lang w:val="en-US"/>
+        </w:rPr>
+        <w:t xml:space="preserve"> w</w:t>
+      </w:r>
+      <w:r>
+        <w:rPr>
+          <w:lang w:val="en-US"/>
+        </w:rPr>
+        <w:t>ere</w:t>
+      </w:r>
+      <w:r>
+        <w:rPr>
+          <w:lang w:val="en-US"/>
+        </w:rPr>
+        <w:t xml:space="preserve"> introduced manually,</w:t>
+      </w:r>
+      <w:r>
+        <w:rPr>
+          <w:lang w:val="en-US"/>
+        </w:rPr>
+        <w:t xml:space="preserve"> the</w:t>
+      </w:r>
+      <w:r>
+        <w:rPr>
+          <w:lang w:val="en-US"/>
+        </w:rPr>
+        <w:t xml:space="preserve"> </w:t>
+      </w:r>
+      <w:r>
+        <w:rPr>
+          <w:lang w:val="en-US"/>
+        </w:rPr>
+        <w:t xml:space="preserve">timing </w:t>
+      </w:r>
+      <w:r>
+        <w:rPr>
+          <w:lang w:val="en-US"/>
+        </w:rPr>
+        <w:t>of</w:t>
+      </w:r>
+      <w:r>
+        <w:rPr>
+          <w:lang w:val="en-US"/>
+        </w:rPr>
+        <w:t xml:space="preserve"> disturbing the sensors</w:t>
+      </w:r>
+      <w:r>
+        <w:rPr>
+          <w:lang w:val="en-US"/>
+        </w:rPr>
+        <w:t xml:space="preserve"> might not have been perfectly in sync</w:t>
+      </w:r>
+      <w:r>
+        <w:rPr>
+          <w:lang w:val="en-US"/>
+        </w:rPr>
+        <w:t xml:space="preserve">. </w:t>
+      </w:r>
+      <w:r>
+        <w:rPr>
+          <w:lang w:val="en-US"/>
+        </w:rPr>
+        <w:t>We suggest using the Unix time data both sensors recorded to align the data, then manually fin</w:t>
+      </w:r>
+      <w:r>
+        <w:rPr>
+          <w:lang w:val="en-US"/>
+        </w:rPr>
+        <w:t>e</w:t>
+      </w:r>
+      <w:r>
+        <w:rPr>
+          <w:lang w:val="en-US"/>
+        </w:rPr>
+        <w:t>tune the alignment using the artifacts and recognizable patterns of the diagram (e.g.</w:t>
+      </w:r>
+      <w:r>
+        <w:rPr>
+          <w:lang w:val="en-US"/>
+        </w:rPr>
+        <w:t xml:space="preserve"> </w:t>
+      </w:r>
+      <w:r>
+        <w:rPr>
+          <w:lang w:val="en-US"/>
+        </w:rPr>
+        <w:t>the R-peaks in the ECG data, and the systole and diastole peaks o</w:t>
+      </w:r>
+      <w:r>
+        <w:rPr>
+          <w:lang w:val="en-US"/>
+        </w:rPr>
+        <w:t>f</w:t>
+      </w:r>
+      <w:r>
+        <w:rPr>
+          <w:lang w:val="en-US"/>
+        </w:rPr>
+        <w:t xml:space="preserve"> the PPG data</w:t>
+      </w:r>
+      <w:r>
+        <w:rPr>
+          <w:lang w:val="en-US"/>
+        </w:rPr>
+        <w:t>).</w:t>
+      </w:r>
+    </w:p>
+    <w:p>
+      <w:pPr>
+        <w:rPr>
+          <w:b/>
+          <w:bCs/>
+          <w:lang w:val="en-US"/>
+        </w:rPr>
+      </w:pPr>
+    </w:p>
+    <w:p>
+      <w:pPr>
+        <w:rPr>
+          <w:b/>
+          <w:bCs/>
+          <w:lang w:val="en-US"/>
+        </w:rPr>
+      </w:pPr>
+      <w:r>
+        <w:rPr>
+          <w:b/>
+          <w:bCs/>
+          <w:lang w:val="en-US"/>
+        </w:rPr>
+        <w:t>Q11</w:t>
+      </w:r>
+      <w:r>
+        <w:rPr>
+          <w:b/>
+          <w:bCs/>
+          <w:lang w:val="en-US"/>
+        </w:rPr>
+        <w:tab/>
+      </w:r>
+      <w:r>
+        <w:rPr>
+          <w:b/>
+          <w:bCs/>
+          <w:lang w:val="en-US"/>
+        </w:rPr>
+        <w:t>Make 2 plots (one above the other) of the histograms computed from ECG</w:t>
+      </w:r>
+    </w:p>
+    <w:p>
+      <w:pPr>
+        <w:rPr>
+          <w:b/>
+          <w:bCs/>
+          <w:lang w:val="en-US"/>
+        </w:rPr>
+      </w:pPr>
+      <w:r>
+        <w:rPr>
+          <w:b/>
+          <w:bCs/>
+          <w:lang w:val="en-US"/>
+        </w:rPr>
+        <w:t xml:space="preserve">signals recorded with the </w:t>
+      </w:r>
+      <w:proofErr w:type="spellStart"/>
+      <w:r>
+        <w:rPr>
+          <w:b/>
+          <w:bCs/>
+          <w:lang w:val="en-US"/>
+        </w:rPr>
+        <w:t>Biopac</w:t>
+      </w:r>
+      <w:proofErr w:type="spellEnd"/>
+      <w:r>
+        <w:rPr>
+          <w:b/>
+          <w:bCs/>
+          <w:lang w:val="en-US"/>
+        </w:rPr>
+        <w:t xml:space="preserve"> device and the smartwatch. How do you interpret these</w:t>
+      </w:r>
+    </w:p>
+    <w:p>
+      <w:pPr>
+        <w:rPr>
+          <w:b/>
+          <w:bCs/>
+          <w:lang w:val="en-US"/>
+        </w:rPr>
+      </w:pPr>
+      <w:r>
+        <w:rPr>
+          <w:b/>
+          <w:bCs/>
+          <w:lang w:val="en-US"/>
+        </w:rPr>
+        <w:t>histograms?</w:t>
+      </w:r>
+    </w:p>
+    <w:p>
+      <w:pPr>
+        <w:rPr>
+          <w:lang w:val="en-US"/>
+        </w:rPr>
+      </w:pPr>
+    </w:p>
+    <w:p>
+      <w:pPr>
+        <w:rPr>
+          <w:lang w:val="en-US"/>
+        </w:rPr>
+      </w:pPr>
+      <w:r>
+        <w:rPr>
+          <w:lang w:val="en-US"/>
+        </w:rPr>
+        <w:t xml:space="preserve">Apart from the intentionally introduced artifact, the </w:t>
+      </w:r>
+      <w:proofErr w:type="spellStart"/>
+      <w:r>
+        <w:rPr>
+          <w:lang w:val="en-US"/>
+        </w:rPr>
+        <w:t>Biopac</w:t>
+      </w:r>
+      <w:proofErr w:type="spellEnd"/>
+      <w:r>
+        <w:rPr>
+          <w:lang w:val="en-US"/>
+        </w:rPr>
+        <w:t xml:space="preserve"> ECG is fairly regular. There are a few R-peaks with a noticeably higher amplitude than most, and a few segments where the heartrate appears to have slowed down noticeably for 2-3 beats. The histogram appears to be a fairly accurate representation of the subject’s heartbeat, with minimal noise.</w:t>
+      </w:r>
+    </w:p>
+    <w:p>
+      <w:pPr>
+        <w:rPr>
+          <w:lang w:val="en-US"/>
+        </w:rPr>
+      </w:pPr>
+      <w:r>
+        <w:rPr>
+          <w:lang w:val="en-US"/>
+        </w:rPr>
+        <w:t xml:space="preserve">The watch’s histogram by comparison is very noisy. Several extreme amplitudes are noticeable, and after a disturbance that lasted about 15 seconds the baseline has shifted entirely. </w:t>
+      </w:r>
+      <w:r>
+        <w:rPr>
+          <w:lang w:val="en-US"/>
+        </w:rPr>
+        <w:t xml:space="preserve">Furthermore, since the watch is only relying on the Einthoven I lead, even undisturbed segments of the data have reduced information load compared to the data yielded from the </w:t>
+      </w:r>
+      <w:proofErr w:type="spellStart"/>
+      <w:r>
+        <w:rPr>
+          <w:lang w:val="en-US"/>
+        </w:rPr>
+        <w:t>Biopac</w:t>
+      </w:r>
+      <w:proofErr w:type="spellEnd"/>
+      <w:r>
+        <w:rPr>
+          <w:lang w:val="en-US"/>
+        </w:rPr>
+        <w:t xml:space="preserve"> device.</w:t>
+      </w:r>
+    </w:p>
+    <w:p>
+      <w:pPr>
+        <w:rPr>
+          <w:lang w:val="en-US"/>
+        </w:rPr>
+      </w:pPr>
+      <w:r>
+        <w:rPr>
+          <w:lang w:val="en-US"/>
+        </w:rPr>
+        <w:t xml:space="preserve">Interestingly, the points where the subject’s heart rate appears to slow down in the </w:t>
+      </w:r>
+      <w:proofErr w:type="spellStart"/>
+      <w:r>
+        <w:rPr>
+          <w:lang w:val="en-US"/>
+        </w:rPr>
+        <w:t>Biopac</w:t>
+      </w:r>
+      <w:proofErr w:type="spellEnd"/>
+      <w:r>
+        <w:rPr>
+          <w:lang w:val="en-US"/>
+        </w:rPr>
+        <w:t xml:space="preserve"> histogram all but one correlate with disturbances visible in the smartwatch histogram. The most uneven part of the </w:t>
+      </w:r>
+      <w:proofErr w:type="spellStart"/>
+      <w:r>
+        <w:rPr>
+          <w:lang w:val="en-US"/>
+        </w:rPr>
+        <w:t>Biopac</w:t>
+      </w:r>
+      <w:proofErr w:type="spellEnd"/>
+      <w:r>
+        <w:rPr>
+          <w:lang w:val="en-US"/>
+        </w:rPr>
+        <w:t xml:space="preserve"> histogram also appears almost at the same time as the longer disturbance on the smartwatch histogram, which shifted the baseline. </w:t>
+      </w:r>
+    </w:p>
+    <w:p>
+      <w:pPr>
+        <w:rPr>
+          <w:lang w:val="en-US"/>
+        </w:rPr>
+      </w:pPr>
+      <w:r>
+        <w:rPr>
+          <w:lang w:val="en-US"/>
+        </w:rPr>
+        <w:t xml:space="preserve">It is also notable that even when there is visibly more noise in a segment of the </w:t>
+      </w:r>
+      <w:proofErr w:type="spellStart"/>
+      <w:r>
+        <w:rPr>
+          <w:lang w:val="en-US"/>
+        </w:rPr>
+        <w:t>Biopac</w:t>
+      </w:r>
+      <w:proofErr w:type="spellEnd"/>
+      <w:r>
+        <w:rPr>
+          <w:lang w:val="en-US"/>
+        </w:rPr>
+        <w:t xml:space="preserve"> histogram, the QRS complex is still decipherable, as the amplitude of the R peak is always higher than any noise. This is decidedly not the case in the watch’s histogram, where the amplitudes introduced by noise are several times bigger than any measured from a heartbeat. </w:t>
+      </w:r>
+    </w:p>
+    <w:p>
+      <w:pPr>
+        <w:rPr>
+          <w:lang w:val="en-US"/>
+        </w:rPr>
+      </w:pPr>
+    </w:p>
+    <w:p>
+      <w:pPr>
+        <w:rPr>
+          <w:b/>
+          <w:bCs/>
+          <w:lang w:val="en-US"/>
+        </w:rPr>
+      </w:pPr>
+      <w:r>
+        <w:rPr>
+          <w:b/>
+          <w:bCs/>
+          <w:lang w:val="en-US"/>
+        </w:rPr>
+        <w:t>Q12</w:t>
+      </w:r>
+      <w:r>
+        <w:rPr>
+          <w:b/>
+          <w:bCs/>
+          <w:lang w:val="en-US"/>
+        </w:rPr>
+        <w:tab/>
+      </w:r>
+      <w:r>
+        <w:rPr>
+          <w:b/>
+          <w:bCs/>
+          <w:lang w:val="en-US"/>
+        </w:rPr>
+        <w:t>Make 2 plots (one above the other) of the histograms computed from PPG</w:t>
+      </w:r>
+    </w:p>
+    <w:p>
+      <w:pPr>
+        <w:rPr>
+          <w:b/>
+          <w:bCs/>
+          <w:lang w:val="en-US"/>
+        </w:rPr>
+      </w:pPr>
+      <w:r>
+        <w:rPr>
+          <w:b/>
+          <w:bCs/>
+          <w:lang w:val="en-US"/>
+        </w:rPr>
+        <w:t xml:space="preserve">signals recorded with the </w:t>
+      </w:r>
+      <w:proofErr w:type="spellStart"/>
+      <w:r>
+        <w:rPr>
+          <w:b/>
+          <w:bCs/>
+          <w:lang w:val="en-US"/>
+        </w:rPr>
+        <w:t>Biopac</w:t>
+      </w:r>
+      <w:proofErr w:type="spellEnd"/>
+      <w:r>
+        <w:rPr>
+          <w:b/>
+          <w:bCs/>
+          <w:lang w:val="en-US"/>
+        </w:rPr>
+        <w:t xml:space="preserve"> device and the smartwatch. How do you interpret these</w:t>
+      </w:r>
+    </w:p>
+    <w:p>
+      <w:pPr>
+        <w:rPr>
+          <w:b/>
+          <w:bCs/>
+          <w:lang w:val="en-US"/>
+        </w:rPr>
+      </w:pPr>
+      <w:r>
+        <w:rPr>
+          <w:b/>
+          <w:bCs/>
+          <w:lang w:val="en-US"/>
+        </w:rPr>
+        <w:t>histograms</w:t>
+      </w:r>
+      <w:r>
+        <w:rPr>
+          <w:b/>
+          <w:bCs/>
+          <w:lang w:val="en-US"/>
+        </w:rPr>
+        <w:t>?</w:t>
+      </w:r>
+    </w:p>
+    <w:p>
+      <w:pPr>
+        <w:rPr>
+          <w:lang w:val="en-US"/>
+        </w:rPr>
+      </w:pPr>
+    </w:p>
+    <w:p>
+      <w:pPr>
+        <w:rPr>
+          <w:lang w:val="en-US"/>
+        </w:rPr>
+      </w:pPr>
+      <w:r>
+        <w:rPr>
+          <w:lang w:val="en-US"/>
+        </w:rPr>
+        <w:t xml:space="preserve">There seems to be very little overlap between the measurements made by both devices. While the </w:t>
+      </w:r>
+      <w:proofErr w:type="spellStart"/>
+      <w:r>
+        <w:rPr>
+          <w:lang w:val="en-US"/>
+        </w:rPr>
+        <w:t>Biopac</w:t>
+      </w:r>
+      <w:proofErr w:type="spellEnd"/>
+      <w:r>
+        <w:rPr>
+          <w:lang w:val="en-US"/>
+        </w:rPr>
+        <w:t xml:space="preserve"> PPG appears reasonably accurate to a possible ground truth, the smartwatch’s data is barely usable. The data is much more noisy</w:t>
+      </w:r>
+      <w:r>
+        <w:rPr>
+          <w:lang w:val="en-US"/>
+        </w:rPr>
+        <w:t xml:space="preserve">, and most changes in average blood pressure visible in the </w:t>
+      </w:r>
+      <w:proofErr w:type="spellStart"/>
+      <w:r>
+        <w:rPr>
+          <w:lang w:val="en-US"/>
+        </w:rPr>
+        <w:t>Biopac</w:t>
+      </w:r>
+      <w:proofErr w:type="spellEnd"/>
+      <w:r>
+        <w:rPr>
+          <w:lang w:val="en-US"/>
+        </w:rPr>
+        <w:t xml:space="preserve"> histogram are barely or not at all represented in the smartwatch’s data. There is also an extreme sudden drop near the end of the smartwatch’s histogram, where the measured value collapses by approximately a third </w:t>
+      </w:r>
+      <w:r>
+        <w:rPr>
+          <w:lang w:val="en-US"/>
+        </w:rPr>
+        <w:t xml:space="preserve">of its value </w:t>
+      </w:r>
+      <w:r>
+        <w:rPr>
+          <w:lang w:val="en-US"/>
+        </w:rPr>
+        <w:t xml:space="preserve">within one cycle. After that drop the watch appears to measure normally again, but with a much lower baseline, </w:t>
+      </w:r>
+      <w:r>
+        <w:rPr>
+          <w:lang w:val="en-US"/>
+        </w:rPr>
+        <w:t>which</w:t>
+      </w:r>
+      <w:r>
+        <w:rPr>
+          <w:lang w:val="en-US"/>
+        </w:rPr>
+        <w:t xml:space="preserve"> raises doubt regarding the validity of that baseline at any point during the measurement. Especially since a disturbance followed by a significantly </w:t>
+      </w:r>
+      <w:r>
+        <w:rPr>
+          <w:lang w:val="en-US"/>
+        </w:rPr>
         <w:lastRenderedPageBreak/>
-        <w:t xml:space="preserve">PPG from the </w:t>
+        <w:t>changed baseline appears at least three times during the measurement period, and those changed baseline</w:t>
+      </w:r>
+      <w:r>
+        <w:rPr>
+          <w:lang w:val="en-US"/>
+        </w:rPr>
+        <w:t>s</w:t>
+      </w:r>
+      <w:r>
+        <w:rPr>
+          <w:lang w:val="en-US"/>
+        </w:rPr>
+        <w:t xml:space="preserve"> do not correlate with changes in average blood pressure observed by </w:t>
       </w:r>
       <w:proofErr w:type="spellStart"/>
       <w:r>
         <w:rPr>
-          <w:b/>
-          <w:bCs/>
           <w:lang w:val="en-US"/>
         </w:rPr>
         <w:t>Biopac</w:t>
@@ -1013,235 +1712,25 @@
       <w:proofErr w:type="spellEnd"/>
       <w:r>
         <w:rPr>
-          <w:b/>
-          <w:bCs/>
-          <w:lang w:val="en-US"/>
-        </w:rPr>
-        <w:t xml:space="preserve"> device with those from the smartwatch.</w:t>
-      </w:r>
-    </w:p>
-    <w:p>
-      <w:pPr>
-        <w:rPr>
-          <w:b/>
-          <w:bCs/>
-          <w:lang w:val="en-US"/>
-        </w:rPr>
-      </w:pPr>
-      <w:r>
-        <w:rPr>
-          <w:b/>
-          <w:bCs/>
-          <w:lang w:val="en-US"/>
-        </w:rPr>
-        <w:t>(Maximum one 10 lines paragraph)</w:t>
-      </w:r>
-    </w:p>
-    <w:p>
-      <w:pPr>
-        <w:rPr>
-          <w:b/>
-          <w:bCs/>
-          <w:lang w:val="en-US"/>
-        </w:rPr>
-      </w:pPr>
-    </w:p>
-    <w:p>
-      <w:pPr>
-        <w:rPr>
-          <w:lang w:val="en-US"/>
-        </w:rPr>
-      </w:pPr>
-      <w:r>
-        <w:rPr>
-          <w:lang w:val="en-US"/>
-        </w:rPr>
-        <w:t>Ideally, syncing the artifacts would sync the data. However, s</w:t>
-      </w:r>
-      <w:r>
-        <w:rPr>
-          <w:lang w:val="en-US"/>
-        </w:rPr>
-        <w:t>ince the artefact</w:t>
-      </w:r>
-      <w:r>
-        <w:rPr>
-          <w:lang w:val="en-US"/>
-        </w:rPr>
-        <w:t>s</w:t>
-      </w:r>
-      <w:r>
-        <w:rPr>
-          <w:lang w:val="en-US"/>
-        </w:rPr>
-        <w:t xml:space="preserve"> w</w:t>
-      </w:r>
-      <w:r>
-        <w:rPr>
-          <w:lang w:val="en-US"/>
-        </w:rPr>
-        <w:t>ere</w:t>
-      </w:r>
-      <w:r>
-        <w:rPr>
-          <w:lang w:val="en-US"/>
-        </w:rPr>
-        <w:t xml:space="preserve"> introduced manually,</w:t>
-      </w:r>
-      <w:r>
-        <w:rPr>
-          <w:lang w:val="en-US"/>
-        </w:rPr>
-        <w:t xml:space="preserve"> the</w:t>
-      </w:r>
-      <w:r>
-        <w:rPr>
-          <w:lang w:val="en-US"/>
-        </w:rPr>
-        <w:t xml:space="preserve"> </w:t>
-      </w:r>
-      <w:r>
-        <w:rPr>
-          <w:lang w:val="en-US"/>
-        </w:rPr>
-        <w:t xml:space="preserve">timing </w:t>
-      </w:r>
-      <w:r>
-        <w:rPr>
-          <w:lang w:val="en-US"/>
-        </w:rPr>
-        <w:t>of</w:t>
-      </w:r>
-      <w:r>
-        <w:rPr>
-          <w:lang w:val="en-US"/>
-        </w:rPr>
-        <w:t xml:space="preserve"> disturbing the sensors</w:t>
-      </w:r>
-      <w:r>
-        <w:rPr>
-          <w:lang w:val="en-US"/>
-        </w:rPr>
-        <w:t xml:space="preserve"> might not have been perfectly in sync</w:t>
-      </w:r>
-      <w:r>
-        <w:rPr>
-          <w:lang w:val="en-US"/>
-        </w:rPr>
-        <w:t xml:space="preserve">. </w:t>
-      </w:r>
-      <w:r>
-        <w:rPr>
-          <w:lang w:val="en-US"/>
-        </w:rPr>
-        <w:t>We suggest using the Unix time data both sensors recorded to align the data, then manually fin</w:t>
-      </w:r>
-      <w:r>
-        <w:rPr>
-          <w:lang w:val="en-US"/>
-        </w:rPr>
-        <w:t>e</w:t>
-      </w:r>
-      <w:r>
-        <w:rPr>
-          <w:lang w:val="en-US"/>
-        </w:rPr>
-        <w:t>tune the alignment using the artifacts and recognizable patterns of the diagram (e.g.</w:t>
-      </w:r>
-      <w:r>
-        <w:rPr>
-          <w:lang w:val="en-US"/>
-        </w:rPr>
-        <w:t xml:space="preserve"> </w:t>
-      </w:r>
-      <w:r>
-        <w:rPr>
-          <w:lang w:val="en-US"/>
-        </w:rPr>
-        <w:t>the R-peaks in the ECG data, and the systole and diastole peaks o</w:t>
-      </w:r>
-      <w:r>
-        <w:rPr>
-          <w:lang w:val="en-US"/>
-        </w:rPr>
-        <w:t>f</w:t>
-      </w:r>
-      <w:r>
-        <w:rPr>
-          <w:lang w:val="en-US"/>
-        </w:rPr>
-        <w:t xml:space="preserve"> the PPG data</w:t>
-      </w:r>
-      <w:r>
-        <w:rPr>
-          <w:lang w:val="en-US"/>
-        </w:rPr>
-        <w:t>).</w:t>
-      </w:r>
-    </w:p>
-    <w:p>
-      <w:pPr>
-        <w:rPr>
-          <w:b/>
-          <w:bCs/>
-          <w:lang w:val="en-US"/>
-        </w:rPr>
-      </w:pPr>
-    </w:p>
-    <w:p>
-      <w:pPr>
-        <w:rPr>
-          <w:b/>
-          <w:bCs/>
-          <w:lang w:val="en-US"/>
-        </w:rPr>
-      </w:pPr>
-      <w:r>
-        <w:rPr>
-          <w:b/>
-          <w:bCs/>
-          <w:lang w:val="en-US"/>
-        </w:rPr>
-        <w:t>Q11</w:t>
-      </w:r>
-      <w:r>
-        <w:rPr>
-          <w:b/>
-          <w:bCs/>
-          <w:lang w:val="en-US"/>
-        </w:rPr>
-        <w:tab/>
-      </w:r>
-      <w:r>
-        <w:rPr>
-          <w:b/>
-          <w:bCs/>
-          <w:lang w:val="en-US"/>
-        </w:rPr>
-        <w:t>Make 2 plots (one above the other) of the histograms computed from ECG</w:t>
-      </w:r>
-    </w:p>
-    <w:p>
-      <w:pPr>
-        <w:rPr>
-          <w:b/>
-          <w:bCs/>
-          <w:lang w:val="en-US"/>
-        </w:rPr>
-      </w:pPr>
-      <w:r>
-        <w:rPr>
-          <w:b/>
-          <w:bCs/>
-          <w:lang w:val="en-US"/>
-        </w:rPr>
-        <w:t xml:space="preserve">signals recorded with the </w:t>
+          <w:lang w:val="en-US"/>
+        </w:rPr>
+        <w:t xml:space="preserve">. In fact, at the time the </w:t>
+      </w:r>
+      <w:r>
+        <w:rPr>
+          <w:lang w:val="en-US"/>
+        </w:rPr>
+        <w:t xml:space="preserve">aforementioned </w:t>
+      </w:r>
+      <w:r>
+        <w:rPr>
+          <w:lang w:val="en-US"/>
+        </w:rPr>
+        <w:t xml:space="preserve">sudden drop appeared in the smartwatch’ data, the </w:t>
       </w:r>
       <w:proofErr w:type="spellStart"/>
       <w:r>
         <w:rPr>
-          <w:b/>
-          <w:bCs/>
           <w:lang w:val="en-US"/>
         </w:rPr>
         <w:t>Biopac</w:t>
@@ -1249,390 +1738,6 @@
       <w:proofErr w:type="spellEnd"/>
       <w:r>
         <w:rPr>
-          <w:b/>
-          <w:bCs/>
-          <w:lang w:val="en-US"/>
-        </w:rPr>
-        <w:t xml:space="preserve"> device and the smartwatch. How do you interpret these</w:t>
-      </w:r>
-    </w:p>
-    <w:p>
-      <w:pPr>
-        <w:rPr>
-          <w:b/>
-          <w:bCs/>
-          <w:lang w:val="en-US"/>
-        </w:rPr>
-      </w:pPr>
-      <w:r>
-        <w:rPr>
-          <w:b/>
-          <w:bCs/>
-          <w:lang w:val="en-US"/>
-        </w:rPr>
-        <w:t>histograms?</w:t>
-      </w:r>
-    </w:p>
-    <w:p>
-      <w:pPr>
-        <w:rPr>
-          <w:lang w:val="en-US"/>
-        </w:rPr>
-      </w:pPr>
-    </w:p>
-    <w:p>
-      <w:pPr>
-        <w:rPr>
-          <w:lang w:val="en-US"/>
-        </w:rPr>
-      </w:pPr>
-      <w:r>
-        <w:rPr>
-          <w:lang w:val="en-US"/>
-        </w:rPr>
-        <w:t xml:space="preserve">Apart from the intentionally introduced artifact, the </w:t>
-      </w:r>
-      <w:proofErr w:type="spellStart"/>
-      <w:r>
-        <w:rPr>
-          <w:lang w:val="en-US"/>
-        </w:rPr>
-        <w:t>Biopac</w:t>
-      </w:r>
-      <w:proofErr w:type="spellEnd"/>
-      <w:r>
-        <w:rPr>
-          <w:lang w:val="en-US"/>
-        </w:rPr>
-        <w:t xml:space="preserve"> ECG is fairly regular. There are a few R-peaks with a noticeably higher amplitude than most, and a few segments where the heartrate appears to have slowed down noticeably for 2-3 beats. The histogram appears to be a fairly accurate representation of the subject’s heartbeat, with minimal noise.</w:t>
-      </w:r>
-    </w:p>
-    <w:p>
-      <w:pPr>
-        <w:rPr>
-          <w:lang w:val="en-US"/>
-        </w:rPr>
-      </w:pPr>
-      <w:r>
-        <w:rPr>
-          <w:lang w:val="en-US"/>
-        </w:rPr>
-        <w:t xml:space="preserve">The watch’s histogram by comparison is very noisy. Several extreme amplitudes are noticeable, and after a disturbance that lasted about 15 seconds the baseline has shifted entirely. </w:t>
-      </w:r>
-      <w:r>
-        <w:rPr>
-          <w:lang w:val="en-US"/>
-        </w:rPr>
-        <w:t xml:space="preserve">Furthermore, since the watch is only relying on the Einthoven I lead, even undisturbed segments of the data have reduced information load compared to the data yielded from the </w:t>
-      </w:r>
-      <w:proofErr w:type="spellStart"/>
-      <w:r>
-        <w:rPr>
-          <w:lang w:val="en-US"/>
-        </w:rPr>
-        <w:t>Biopac</w:t>
-      </w:r>
-      <w:proofErr w:type="spellEnd"/>
-      <w:r>
-        <w:rPr>
-          <w:lang w:val="en-US"/>
-        </w:rPr>
-        <w:t xml:space="preserve"> device.</w:t>
-      </w:r>
-    </w:p>
-    <w:p>
-      <w:pPr>
-        <w:rPr>
-          <w:lang w:val="en-US"/>
-        </w:rPr>
-      </w:pPr>
-      <w:r>
-        <w:rPr>
-          <w:lang w:val="en-US"/>
-        </w:rPr>
-        <w:t xml:space="preserve">Interestingly, the points where the subject’s heart rate appears to slow down in the </w:t>
-      </w:r>
-      <w:proofErr w:type="spellStart"/>
-      <w:r>
-        <w:rPr>
-          <w:lang w:val="en-US"/>
-        </w:rPr>
-        <w:t>Biopac</w:t>
-      </w:r>
-      <w:proofErr w:type="spellEnd"/>
-      <w:r>
-        <w:rPr>
-          <w:lang w:val="en-US"/>
-        </w:rPr>
-        <w:t xml:space="preserve"> histogram all but one correlate with disturbances visible in the smartwatch histogram. The most uneven part of the </w:t>
-      </w:r>
-      <w:proofErr w:type="spellStart"/>
-      <w:r>
-        <w:rPr>
-          <w:lang w:val="en-US"/>
-        </w:rPr>
-        <w:t>Biopac</w:t>
-      </w:r>
-      <w:proofErr w:type="spellEnd"/>
-      <w:r>
-        <w:rPr>
-          <w:lang w:val="en-US"/>
-        </w:rPr>
-        <w:t xml:space="preserve"> histogram also appears almost at the same time as the longer disturbance on the smartwatch histogram, which shifted the baseline. </w:t>
-      </w:r>
-    </w:p>
-    <w:p>
-      <w:pPr>
-        <w:rPr>
-          <w:lang w:val="en-US"/>
-        </w:rPr>
-      </w:pPr>
-      <w:r>
-        <w:rPr>
-          <w:lang w:val="en-US"/>
-        </w:rPr>
-        <w:t xml:space="preserve">It is also notable that even when there is visibly more noise in a segment of the </w:t>
-      </w:r>
-      <w:proofErr w:type="spellStart"/>
-      <w:r>
-        <w:rPr>
-          <w:lang w:val="en-US"/>
-        </w:rPr>
-        <w:t>Biopac</w:t>
-      </w:r>
-      <w:proofErr w:type="spellEnd"/>
-      <w:r>
-        <w:rPr>
-          <w:lang w:val="en-US"/>
-        </w:rPr>
-        <w:t xml:space="preserve"> histogram, the QRS complex is still decipherable, as the amplitude of the R peak is always higher than any noise. This is decidedly not the case in the watch’s histogram, where the amplitudes introduced by noise are several times bigger than any measured from a heartbeat. </w:t>
-      </w:r>
-    </w:p>
-    <w:p>
-      <w:pPr>
-        <w:rPr>
-          <w:lang w:val="en-US"/>
-        </w:rPr>
-      </w:pPr>
-    </w:p>
-    <w:p>
-      <w:pPr>
-        <w:rPr>
-          <w:b/>
-          <w:bCs/>
-          <w:lang w:val="en-US"/>
-        </w:rPr>
-      </w:pPr>
-      <w:r>
-        <w:rPr>
-          <w:b/>
-          <w:bCs/>
-          <w:lang w:val="en-US"/>
-        </w:rPr>
-        <w:t>Q12</w:t>
-      </w:r>
-      <w:r>
-        <w:rPr>
-          <w:b/>
-          <w:bCs/>
-          <w:lang w:val="en-US"/>
-        </w:rPr>
-        <w:tab/>
-      </w:r>
-      <w:r>
-        <w:rPr>
-          <w:b/>
-          <w:bCs/>
-          <w:lang w:val="en-US"/>
-        </w:rPr>
-        <w:t>Make 2 plots (one above the other) of the histograms computed from PPG</w:t>
-      </w:r>
-    </w:p>
-    <w:p>
-      <w:pPr>
-        <w:rPr>
-          <w:b/>
-          <w:bCs/>
-          <w:lang w:val="en-US"/>
-        </w:rPr>
-      </w:pPr>
-      <w:r>
-        <w:rPr>
-          <w:b/>
-          <w:bCs/>
-          <w:lang w:val="en-US"/>
-        </w:rPr>
-        <w:t xml:space="preserve">signals recorded with the </w:t>
-      </w:r>
-      <w:proofErr w:type="spellStart"/>
-      <w:r>
-        <w:rPr>
-          <w:b/>
-          <w:bCs/>
-          <w:lang w:val="en-US"/>
-        </w:rPr>
-        <w:t>Biopac</w:t>
-      </w:r>
-      <w:proofErr w:type="spellEnd"/>
-      <w:r>
-        <w:rPr>
-          <w:b/>
-          <w:bCs/>
-          <w:lang w:val="en-US"/>
-        </w:rPr>
-        <w:t xml:space="preserve"> device and the smartwatch. How do you interpret these</w:t>
-      </w:r>
-    </w:p>
-    <w:p>
-      <w:pPr>
-        <w:rPr>
-          <w:b/>
-          <w:bCs/>
-          <w:lang w:val="en-US"/>
-        </w:rPr>
-      </w:pPr>
-      <w:r>
-        <w:rPr>
-          <w:b/>
-          <w:bCs/>
-          <w:lang w:val="en-US"/>
-        </w:rPr>
-        <w:t>histograms</w:t>
-      </w:r>
-      <w:r>
-        <w:rPr>
-          <w:b/>
-          <w:bCs/>
-          <w:lang w:val="en-US"/>
-        </w:rPr>
-        <w:t>?</w:t>
-      </w:r>
-    </w:p>
-    <w:p>
-      <w:pPr>
-        <w:rPr>
-          <w:lang w:val="en-US"/>
-        </w:rPr>
-      </w:pPr>
-    </w:p>
-    <w:p>
-      <w:pPr>
-        <w:rPr>
-          <w:lang w:val="en-US"/>
-        </w:rPr>
-      </w:pPr>
-      <w:r>
-        <w:rPr>
-          <w:lang w:val="en-US"/>
-        </w:rPr>
-        <w:t xml:space="preserve">There seems to be very little overlap between the measurements made by both devices. While the </w:t>
-      </w:r>
-      <w:proofErr w:type="spellStart"/>
-      <w:r>
-        <w:rPr>
-          <w:lang w:val="en-US"/>
-        </w:rPr>
-        <w:t>Biopac</w:t>
-      </w:r>
-      <w:proofErr w:type="spellEnd"/>
-      <w:r>
-        <w:rPr>
-          <w:lang w:val="en-US"/>
-        </w:rPr>
-        <w:t xml:space="preserve"> PPG appears reasonably accurate to a possible ground truth, the smartwatch’s data is barely usable. The data is much more noisy</w:t>
-      </w:r>
-      <w:r>
-        <w:rPr>
-          <w:lang w:val="en-US"/>
-        </w:rPr>
-        <w:t xml:space="preserve">, and most changes in average blood pressure visible in the </w:t>
-      </w:r>
-      <w:proofErr w:type="spellStart"/>
-      <w:r>
-        <w:rPr>
-          <w:lang w:val="en-US"/>
-        </w:rPr>
-        <w:t>Biopac</w:t>
-      </w:r>
-      <w:proofErr w:type="spellEnd"/>
-      <w:r>
-        <w:rPr>
-          <w:lang w:val="en-US"/>
-        </w:rPr>
-        <w:t xml:space="preserve"> histogram are barely or not at all represented in the smartwatch’s data. There is also an extreme sudden drop near the end of the smartwatch’s histogram, where the measured value collapses by approximately a third </w:t>
-      </w:r>
-      <w:r>
-        <w:rPr>
-          <w:lang w:val="en-US"/>
-        </w:rPr>
-        <w:t xml:space="preserve">of its value </w:t>
-      </w:r>
-      <w:r>
-        <w:rPr>
-          <w:lang w:val="en-US"/>
-        </w:rPr>
-        <w:t xml:space="preserve">within one cycle. After that drop the watch appears to measure normally again, but with a much lower baseline, </w:t>
-      </w:r>
-      <w:r>
-        <w:rPr>
-          <w:lang w:val="en-US"/>
-        </w:rPr>
-        <w:t>which</w:t>
-      </w:r>
-      <w:r>
-        <w:rPr>
-          <w:lang w:val="en-US"/>
-        </w:rPr>
-        <w:t xml:space="preserve"> raises doubt regarding the validity of that baseline at any point during the measurement. Especially since a disturbance followed by a significantly changed baseline appears at least three times during the measurement period, and those changed baseline</w:t>
-      </w:r>
-      <w:r>
-        <w:rPr>
-          <w:lang w:val="en-US"/>
-        </w:rPr>
-        <w:t>s</w:t>
-      </w:r>
-      <w:r>
-        <w:rPr>
-          <w:lang w:val="en-US"/>
-        </w:rPr>
-        <w:t xml:space="preserve"> do not correlate with changes in average blood pressure observed by </w:t>
-      </w:r>
-      <w:proofErr w:type="spellStart"/>
-      <w:r>
-        <w:rPr>
-          <w:lang w:val="en-US"/>
-        </w:rPr>
-        <w:t>Biopac</w:t>
-      </w:r>
-      <w:proofErr w:type="spellEnd"/>
-      <w:r>
-        <w:rPr>
-          <w:lang w:val="en-US"/>
-        </w:rPr>
-        <w:t xml:space="preserve">. In fact, at the time the </w:t>
-      </w:r>
-      <w:r>
-        <w:rPr>
-          <w:lang w:val="en-US"/>
-        </w:rPr>
-        <w:t xml:space="preserve">aforementioned </w:t>
-      </w:r>
-      <w:r>
-        <w:rPr>
-          <w:lang w:val="en-US"/>
-        </w:rPr>
-        <w:t xml:space="preserve">sudden drop appeared in the smartwatch’ data, the </w:t>
-      </w:r>
-      <w:proofErr w:type="spellStart"/>
-      <w:r>
-        <w:rPr>
-          <w:lang w:val="en-US"/>
-        </w:rPr>
-        <w:t>Biopac</w:t>
-      </w:r>
-      <w:proofErr w:type="spellEnd"/>
-      <w:r>
-        <w:rPr>
           <w:lang w:val="en-US"/>
         </w:rPr>
         <w:t xml:space="preserve"> device measured an increase in blood pressure. </w:t>
@@ -1675,7 +1780,6 @@
         <w:rPr>
           <w:lang w:val="en-US"/>
         </w:rPr>
-        <w:lastRenderedPageBreak/>
         <w:t>Literature</w:t>
       </w:r>
     </w:p>
@@ -4512,8 +4616,8 @@
     <w:rsidRoot w:val="000A2E78"/>
     <w:rsid w:val="000A2E78"/>
     <w:rsid w:val="000C62A0"/>
+    <w:rsid w:val="00142768"/>
     <w:rsid w:val="00390A6A"/>
-    <w:rsid w:val="0045224A"/>
     <w:rsid w:val="00532719"/>
     <w:rsid w:val="006A7CFE"/>
     <w:rsid w:val="006E13AA"/>

</xml_diff>

<commit_message>
Slight fixed to report
</commit_message>
<xml_diff>
--- a/Report.docx
+++ b/Report.docx
@@ -820,25 +820,7 @@
           <w:bCs/>
           <w:lang w:val="en-US"/>
         </w:rPr>
-        <w:t xml:space="preserve">Make 2 plots (one above the other) of the ECG from the </w:t>
-      </w:r>
-      <w:proofErr w:type="spellStart"/>
-      <w:r>
-        <w:rPr>
-          <w:b/>
-          <w:bCs/>
-          <w:lang w:val="en-US"/>
-        </w:rPr>
-        <w:t>Biopac</w:t>
-      </w:r>
-      <w:proofErr w:type="spellEnd"/>
-      <w:r>
-        <w:rPr>
-          <w:b/>
-          <w:bCs/>
-          <w:lang w:val="en-US"/>
-        </w:rPr>
-        <w:t xml:space="preserve"> device and</w:t>
+        <w:t>Make 2 plots (one above the other) of the ECG from the Biopac device and</w:t>
       </w:r>
     </w:p>
     <w:p>
@@ -872,25 +854,7 @@
           <w:bCs/>
           <w:lang w:val="en-US"/>
         </w:rPr>
-        <w:t xml:space="preserve">plots? Make 2 plots (one above the other) of the PPG from the </w:t>
-      </w:r>
-      <w:proofErr w:type="spellStart"/>
-      <w:r>
-        <w:rPr>
-          <w:b/>
-          <w:bCs/>
-          <w:lang w:val="en-US"/>
-        </w:rPr>
-        <w:t>Biopac</w:t>
-      </w:r>
-      <w:proofErr w:type="spellEnd"/>
-      <w:r>
-        <w:rPr>
-          <w:b/>
-          <w:bCs/>
-          <w:lang w:val="en-US"/>
-        </w:rPr>
-        <w:t xml:space="preserve"> device and the</w:t>
+        <w:t>plots? Make 2 plots (one above the other) of the PPG from the Biopac device and the</w:t>
       </w:r>
     </w:p>
     <w:p>
@@ -960,40 +924,13 @@
         <w:rPr>
           <w:lang w:val="en-US"/>
         </w:rPr>
-        <w:t xml:space="preserve">a different form. In the </w:t>
-      </w:r>
-      <w:proofErr w:type="spellStart"/>
-      <w:r>
-        <w:rPr>
-          <w:lang w:val="en-US"/>
-        </w:rPr>
-        <w:t>BioPac</w:t>
-      </w:r>
-      <w:proofErr w:type="spellEnd"/>
-      <w:r>
-        <w:rPr>
-          <w:lang w:val="en-US"/>
-        </w:rPr>
-        <w:t xml:space="preserve"> recordings, the artifact is visible as short period of strong positive and negative (in relation to the baseline) amplitudes appearing in rapid succession. In the smartwatch ECG the artifact appears as </w:t>
-      </w:r>
-      <w:r>
-        <w:rPr>
-          <w:lang w:val="en-US"/>
-        </w:rPr>
-        <w:t>two extreme spikes in both directions, followed by a slow return to the baseline. In the smartwatch PPG the artifact appears as a sudden spike in blood pressure. However, after the spike the baseline blood pressure stays on the level of that spike, so it is possible that we failed to introduce a visible artifact entirely, and this is just a natural spike in blood pressure that happened to occur at the same time as our attempt to create noise in the data.</w:t>
-      </w:r>
-      <w:r>
-        <w:rPr>
-          <w:lang w:val="en-US"/>
-        </w:rPr>
-        <w:t xml:space="preserve"> Considering how </w:t>
-      </w:r>
-      <w:r>
-        <w:rPr>
-          <w:lang w:val="en-US"/>
-        </w:rPr>
-        <w:lastRenderedPageBreak/>
-        <w:t>sudden and extreme the spike is, it is more likely that the smartwatch failed to return to its base value after the disturbance, and that the disturbance changed the results yielded from the further measurements.</w:t>
+        <w:t xml:space="preserve">a different form. In the BioPac recordings, the artifact is visible as short period of strong positive and negative (in relation to the baseline) amplitudes appearing in rapid succession. In the smartwatch ECG the artifact appears as </w:t>
+      </w:r>
+      <w:r>
+        <w:rPr>
+          <w:lang w:val="en-US"/>
+        </w:rPr>
+        <w:t>two extreme spikes in both directions, followed by a slow return to the baseline. In the smartwatch PPG the artifact appears as a sudden spike in blood pressure.</w:t>
       </w:r>
     </w:p>
     <w:p>
@@ -1012,35 +949,7 @@
         <w:rPr>
           <w:lang w:val="en-US"/>
         </w:rPr>
-        <w:t xml:space="preserve">later in the </w:t>
-      </w:r>
-      <w:proofErr w:type="spellStart"/>
-      <w:r>
-        <w:rPr>
-          <w:lang w:val="en-US"/>
-        </w:rPr>
-        <w:t>Biopac</w:t>
-      </w:r>
-      <w:proofErr w:type="spellEnd"/>
-      <w:r>
-        <w:rPr>
-          <w:lang w:val="en-US"/>
-        </w:rPr>
-        <w:t xml:space="preserve"> data compared to the smartwatch’s data in both measurements. The </w:t>
-      </w:r>
-      <w:proofErr w:type="spellStart"/>
-      <w:r>
-        <w:rPr>
-          <w:lang w:val="en-US"/>
-        </w:rPr>
-        <w:t>Biopac</w:t>
-      </w:r>
-      <w:proofErr w:type="spellEnd"/>
-      <w:r>
-        <w:rPr>
-          <w:lang w:val="en-US"/>
-        </w:rPr>
-        <w:t xml:space="preserve"> data appears slightly delayed to the smartwatch’s data.</w:t>
+        <w:t>later in the Biopac data compared to the smartwatch’s data in both measurements. The Biopac data appears slightly delayed to the smartwatch’s data.</w:t>
       </w:r>
     </w:p>
     <w:p>
@@ -1097,25 +1006,7 @@
           <w:bCs/>
           <w:lang w:val="en-US"/>
         </w:rPr>
-        <w:t xml:space="preserve">PPG from the </w:t>
-      </w:r>
-      <w:proofErr w:type="spellStart"/>
-      <w:r>
-        <w:rPr>
-          <w:b/>
-          <w:bCs/>
-          <w:lang w:val="en-US"/>
-        </w:rPr>
-        <w:t>Biopac</w:t>
-      </w:r>
-      <w:proofErr w:type="spellEnd"/>
-      <w:r>
-        <w:rPr>
-          <w:b/>
-          <w:bCs/>
-          <w:lang w:val="en-US"/>
-        </w:rPr>
-        <w:t xml:space="preserve"> device with those from the smartwatch.</w:t>
+        <w:t>PPG from the Biopac device with those from the smartwatch.</w:t>
       </w:r>
     </w:p>
     <w:p>
@@ -1232,7 +1123,19 @@
         <w:rPr>
           <w:lang w:val="en-US"/>
         </w:rPr>
-        <w:t>We suggest using the Unix time data both sensors recorded to align the data, then manually fin</w:t>
+        <w:t xml:space="preserve">We suggest using the </w:t>
+      </w:r>
+      <w:r>
+        <w:rPr>
+          <w:lang w:val="en-US"/>
+        </w:rPr>
+        <w:t>time of recording reported by the sensors</w:t>
+      </w:r>
+      <w:r>
+        <w:rPr>
+          <w:lang w:val="en-US"/>
+        </w:rPr>
+        <w:t xml:space="preserve"> to align the data, then manually fin</w:t>
       </w:r>
       <w:r>
         <w:rPr>
@@ -1276,6 +1179,12 @@
         </w:rPr>
         <w:t>).</w:t>
       </w:r>
+      <w:r>
+        <w:rPr>
+          <w:lang w:val="en-US"/>
+        </w:rPr>
+        <w:t xml:space="preserve"> In this case, the Biopac data was approximately 1.7 seconds ahead of the smartwatch’s data. </w:t>
+      </w:r>
     </w:p>
     <w:p>
       <w:pPr>
@@ -1333,25 +1242,7 @@
           <w:bCs/>
           <w:lang w:val="en-US"/>
         </w:rPr>
-        <w:t xml:space="preserve">signals recorded with the </w:t>
-      </w:r>
-      <w:proofErr w:type="spellStart"/>
-      <w:r>
-        <w:rPr>
-          <w:b/>
-          <w:bCs/>
-          <w:lang w:val="en-US"/>
-        </w:rPr>
-        <w:t>Biopac</w:t>
-      </w:r>
-      <w:proofErr w:type="spellEnd"/>
-      <w:r>
-        <w:rPr>
-          <w:b/>
-          <w:bCs/>
-          <w:lang w:val="en-US"/>
-        </w:rPr>
-        <w:t xml:space="preserve"> device and the smartwatch. How do you interpret these</w:t>
+        <w:t>signals recorded with the Biopac device and the smartwatch. How do you interpret these</w:t>
       </w:r>
     </w:p>
     <w:p>
@@ -1388,21 +1279,7 @@
         <w:rPr>
           <w:lang w:val="en-US"/>
         </w:rPr>
-        <w:t xml:space="preserve">Apart from the intentionally introduced artifact, the </w:t>
-      </w:r>
-      <w:proofErr w:type="spellStart"/>
-      <w:r>
-        <w:rPr>
-          <w:lang w:val="en-US"/>
-        </w:rPr>
-        <w:t>Biopac</w:t>
-      </w:r>
-      <w:proofErr w:type="spellEnd"/>
-      <w:r>
-        <w:rPr>
-          <w:lang w:val="en-US"/>
-        </w:rPr>
-        <w:t xml:space="preserve"> ECG is fairly regular. There are a few R-peaks with a noticeably higher amplitude than most, and a few segments where the heartrate appears to have slowed down noticeably for 2-3 beats. The histogram appears to be a fairly accurate representation of the subject’s heartbeat, with minimal noise.</w:t>
+        <w:t>Apart from the intentionally introduced artifact, the Biopac ECG is fairly regular. There are a few R-peaks with a noticeably higher amplitude than most, and a few segments where the heartrate appears to have slowed down noticeably for 2-3 beats. The histogram appears to be a fairly accurate representation of the subject’s heartbeat, with minimal noise.</w:t>
       </w:r>
     </w:p>
     <w:p>
@@ -1421,89 +1298,33 @@
         <w:rPr>
           <w:lang w:val="en-US"/>
         </w:rPr>
-        <w:t xml:space="preserve">Furthermore, since the watch is only relying on the Einthoven I lead, even undisturbed segments of the data have reduced information load compared to the data yielded from the </w:t>
-      </w:r>
-      <w:proofErr w:type="spellStart"/>
-      <w:r>
-        <w:rPr>
-          <w:lang w:val="en-US"/>
-        </w:rPr>
-        <w:t>Biopac</w:t>
-      </w:r>
-      <w:proofErr w:type="spellEnd"/>
-      <w:r>
-        <w:rPr>
-          <w:lang w:val="en-US"/>
-        </w:rPr>
-        <w:t xml:space="preserve"> device.</w:t>
-      </w:r>
-    </w:p>
-    <w:p>
-      <w:pPr>
-        <w:rPr>
-          <w:lang w:val="en-US"/>
-        </w:rPr>
-      </w:pPr>
-      <w:r>
-        <w:rPr>
-          <w:lang w:val="en-US"/>
-        </w:rPr>
-        <w:t xml:space="preserve">Interestingly, the points where the subject’s heart rate appears to slow down in the </w:t>
-      </w:r>
-      <w:proofErr w:type="spellStart"/>
-      <w:r>
-        <w:rPr>
-          <w:lang w:val="en-US"/>
-        </w:rPr>
-        <w:t>Biopac</w:t>
-      </w:r>
-      <w:proofErr w:type="spellEnd"/>
-      <w:r>
-        <w:rPr>
-          <w:lang w:val="en-US"/>
-        </w:rPr>
-        <w:t xml:space="preserve"> histogram all but one correlate with disturbances visible in the smartwatch histogram. The most uneven part of the </w:t>
-      </w:r>
-      <w:proofErr w:type="spellStart"/>
-      <w:r>
-        <w:rPr>
-          <w:lang w:val="en-US"/>
-        </w:rPr>
-        <w:t>Biopac</w:t>
-      </w:r>
-      <w:proofErr w:type="spellEnd"/>
-      <w:r>
-        <w:rPr>
-          <w:lang w:val="en-US"/>
-        </w:rPr>
-        <w:t xml:space="preserve"> histogram also appears almost at the same time as the longer disturbance on the smartwatch histogram, which shifted the baseline. </w:t>
-      </w:r>
-    </w:p>
-    <w:p>
-      <w:pPr>
-        <w:rPr>
-          <w:lang w:val="en-US"/>
-        </w:rPr>
-      </w:pPr>
-      <w:r>
-        <w:rPr>
-          <w:lang w:val="en-US"/>
-        </w:rPr>
-        <w:t xml:space="preserve">It is also notable that even when there is visibly more noise in a segment of the </w:t>
-      </w:r>
-      <w:proofErr w:type="spellStart"/>
-      <w:r>
-        <w:rPr>
-          <w:lang w:val="en-US"/>
-        </w:rPr>
-        <w:t>Biopac</w:t>
-      </w:r>
-      <w:proofErr w:type="spellEnd"/>
-      <w:r>
-        <w:rPr>
-          <w:lang w:val="en-US"/>
-        </w:rPr>
-        <w:t xml:space="preserve"> histogram, the QRS complex is still decipherable, as the amplitude of the R peak is always higher than any noise. This is decidedly not the case in the watch’s histogram, where the amplitudes introduced by noise are several times bigger than any measured from a heartbeat. </w:t>
+        <w:t>Furthermore, since the watch is only relying on the Einthoven I lead, even undisturbed segments of the data have reduced information load compared to the data yielded from the Biopac device.</w:t>
+      </w:r>
+    </w:p>
+    <w:p>
+      <w:pPr>
+        <w:rPr>
+          <w:lang w:val="en-US"/>
+        </w:rPr>
+      </w:pPr>
+      <w:r>
+        <w:rPr>
+          <w:lang w:val="en-US"/>
+        </w:rPr>
+        <w:t xml:space="preserve">Interestingly, the points where the subject’s heart rate appears to slow down in the Biopac histogram all but one correlate with disturbances visible in the smartwatch histogram. The most uneven part of the Biopac histogram also appears almost at the same time as the longer disturbance on the smartwatch histogram, which shifted the baseline. </w:t>
+      </w:r>
+    </w:p>
+    <w:p>
+      <w:pPr>
+        <w:rPr>
+          <w:lang w:val="en-US"/>
+        </w:rPr>
+      </w:pPr>
+      <w:r>
+        <w:rPr>
+          <w:lang w:val="en-US"/>
+        </w:rPr>
+        <w:t xml:space="preserve">It is also notable that even when there is visibly more noise in a segment of the Biopac histogram, the QRS complex is still decipherable, as the amplitude of the R peak is always higher than any noise. This is decidedly not the case in the watch’s histogram, where the amplitudes introduced by noise are several times bigger than any measured from a heartbeat. </w:t>
       </w:r>
     </w:p>
     <w:p>
@@ -1560,25 +1381,7 @@
           <w:bCs/>
           <w:lang w:val="en-US"/>
         </w:rPr>
-        <w:t xml:space="preserve">signals recorded with the </w:t>
-      </w:r>
-      <w:proofErr w:type="spellStart"/>
-      <w:r>
-        <w:rPr>
-          <w:b/>
-          <w:bCs/>
-          <w:lang w:val="en-US"/>
-        </w:rPr>
-        <w:t>Biopac</w:t>
-      </w:r>
-      <w:proofErr w:type="spellEnd"/>
-      <w:r>
-        <w:rPr>
-          <w:b/>
-          <w:bCs/>
-          <w:lang w:val="en-US"/>
-        </w:rPr>
-        <w:t xml:space="preserve"> device and the smartwatch. How do you interpret these</w:t>
+        <w:t>signals recorded with the Biopac device and the smartwatch. How do you interpret these</w:t>
       </w:r>
     </w:p>
     <w:p>
@@ -1623,41 +1426,13 @@
         <w:rPr>
           <w:lang w:val="en-US"/>
         </w:rPr>
-        <w:t xml:space="preserve">There seems to be very little overlap between the measurements made by both devices. While the </w:t>
-      </w:r>
-      <w:proofErr w:type="spellStart"/>
-      <w:r>
-        <w:rPr>
-          <w:lang w:val="en-US"/>
-        </w:rPr>
-        <w:t>Biopac</w:t>
-      </w:r>
-      <w:proofErr w:type="spellEnd"/>
-      <w:r>
-        <w:rPr>
-          <w:lang w:val="en-US"/>
-        </w:rPr>
-        <w:t xml:space="preserve"> PPG appears reasonably accurate to a possible ground truth, the smartwatch’s data is barely usable. The data is much more noisy</w:t>
-      </w:r>
-      <w:r>
-        <w:rPr>
-          <w:lang w:val="en-US"/>
-        </w:rPr>
-        <w:t xml:space="preserve">, and most changes in average blood pressure visible in the </w:t>
-      </w:r>
-      <w:proofErr w:type="spellStart"/>
-      <w:r>
-        <w:rPr>
-          <w:lang w:val="en-US"/>
-        </w:rPr>
-        <w:t>Biopac</w:t>
-      </w:r>
-      <w:proofErr w:type="spellEnd"/>
-      <w:r>
-        <w:rPr>
-          <w:lang w:val="en-US"/>
-        </w:rPr>
-        <w:t xml:space="preserve"> histogram are barely or not at all represented in the smartwatch’s data. There is also an extreme sudden drop near the end of the smartwatch’s histogram, where the measured value collapses by approximately a third </w:t>
+        <w:t>There seems to be very little overlap between the measurements made by both devices. While the Biopac PPG appears reasonably accurate to a possible ground truth, the smartwatch’s data is barely usable. The data is much more noisy</w:t>
+      </w:r>
+      <w:r>
+        <w:rPr>
+          <w:lang w:val="en-US"/>
+        </w:rPr>
+        <w:t xml:space="preserve">, and most changes in average blood pressure visible in the Biopac histogram are barely or not at all represented in the smartwatch’s data. There is also an extreme sudden drop near the end of the smartwatch’s histogram, where the measured value collapses by approximately a third </w:t>
       </w:r>
       <w:r>
         <w:rPr>
@@ -1681,78 +1456,44 @@
         <w:rPr>
           <w:lang w:val="en-US"/>
         </w:rPr>
-        <w:t xml:space="preserve"> raises doubt regarding the validity of that baseline at any point during the measurement. Especially since a disturbance followed by a significantly </w:t>
-      </w:r>
+        <w:t xml:space="preserve"> raises doubt regarding the validity of that baseline at any point during the measurement. Especially since a disturbance followed by a significantly changed baseline appears at least three times during the measurement period, and those changed baseline</w:t>
+      </w:r>
+      <w:r>
+        <w:rPr>
+          <w:lang w:val="en-US"/>
+        </w:rPr>
+        <w:t>s</w:t>
+      </w:r>
+      <w:r>
+        <w:rPr>
+          <w:lang w:val="en-US"/>
+        </w:rPr>
+        <w:t xml:space="preserve"> do not correlate with changes in average blood pressure observed by Biopac. In fact, at the time the </w:t>
+      </w:r>
+      <w:r>
+        <w:rPr>
+          <w:lang w:val="en-US"/>
+        </w:rPr>
+        <w:t xml:space="preserve">aforementioned </w:t>
+      </w:r>
+      <w:r>
+        <w:rPr>
+          <w:lang w:val="en-US"/>
+        </w:rPr>
+        <w:t xml:space="preserve">sudden drop appeared in the smartwatch’ data, the Biopac device measured an increase in blood pressure. </w:t>
+      </w:r>
+    </w:p>
+    <w:p>
+      <w:pPr>
+        <w:rPr>
+          <w:lang w:val="en-US"/>
+        </w:rPr>
+      </w:pPr>
       <w:r>
         <w:rPr>
           <w:lang w:val="en-US"/>
         </w:rPr>
         <w:lastRenderedPageBreak/>
-        <w:t>changed baseline appears at least three times during the measurement period, and those changed baseline</w:t>
-      </w:r>
-      <w:r>
-        <w:rPr>
-          <w:lang w:val="en-US"/>
-        </w:rPr>
-        <w:t>s</w:t>
-      </w:r>
-      <w:r>
-        <w:rPr>
-          <w:lang w:val="en-US"/>
-        </w:rPr>
-        <w:t xml:space="preserve"> do not correlate with changes in average blood pressure observed by </w:t>
-      </w:r>
-      <w:proofErr w:type="spellStart"/>
-      <w:r>
-        <w:rPr>
-          <w:lang w:val="en-US"/>
-        </w:rPr>
-        <w:t>Biopac</w:t>
-      </w:r>
-      <w:proofErr w:type="spellEnd"/>
-      <w:r>
-        <w:rPr>
-          <w:lang w:val="en-US"/>
-        </w:rPr>
-        <w:t xml:space="preserve">. In fact, at the time the </w:t>
-      </w:r>
-      <w:r>
-        <w:rPr>
-          <w:lang w:val="en-US"/>
-        </w:rPr>
-        <w:t xml:space="preserve">aforementioned </w:t>
-      </w:r>
-      <w:r>
-        <w:rPr>
-          <w:lang w:val="en-US"/>
-        </w:rPr>
-        <w:t xml:space="preserve">sudden drop appeared in the smartwatch’ data, the </w:t>
-      </w:r>
-      <w:proofErr w:type="spellStart"/>
-      <w:r>
-        <w:rPr>
-          <w:lang w:val="en-US"/>
-        </w:rPr>
-        <w:t>Biopac</w:t>
-      </w:r>
-      <w:proofErr w:type="spellEnd"/>
-      <w:r>
-        <w:rPr>
-          <w:lang w:val="en-US"/>
-        </w:rPr>
-        <w:t xml:space="preserve"> device measured an increase in blood pressure. </w:t>
-      </w:r>
-    </w:p>
-    <w:p>
-      <w:pPr>
-        <w:rPr>
-          <w:lang w:val="en-US"/>
-        </w:rPr>
-      </w:pPr>
-      <w:r>
-        <w:rPr>
-          <w:lang w:val="en-US"/>
-        </w:rPr>
         <w:t xml:space="preserve">Much more so than the watch’s ECG data, which was </w:t>
       </w:r>
       <w:r>
@@ -4616,7 +4357,6 @@
     <w:rsidRoot w:val="000A2E78"/>
     <w:rsid w:val="000A2E78"/>
     <w:rsid w:val="000C62A0"/>
-    <w:rsid w:val="00142768"/>
     <w:rsid w:val="00390A6A"/>
     <w:rsid w:val="00532719"/>
     <w:rsid w:val="006A7CFE"/>
@@ -4625,6 +4365,7 @@
     <w:rsid w:val="00A36F1E"/>
     <w:rsid w:val="00A467CE"/>
     <w:rsid w:val="00C04012"/>
+    <w:rsid w:val="00F3379D"/>
     <w:rsid w:val="00F56F7F"/>
   </w:rsids>
   <m:mathPr>

</xml_diff>